<commit_message>
Freeze MVP architecture, exploration atlas UX and project documentation
</commit_message>
<xml_diff>
--- a/docs/state/current source/Visual Grammar And Eda Structure Masterplan Addendum.docx
+++ b/docs/state/current source/Visual Grammar And Eda Structure Masterplan Addendum.docx
@@ -14,23 +14,7 @@
           <w:b/>
           <w:bCs/>
         </w:rPr>
-        <w:t xml:space="preserve">Visual Grammar </w:t>
-      </w:r>
-      <w:proofErr w:type="gramStart"/>
-      <w:r>
-        <w:rPr>
-          <w:b/>
-          <w:bCs/>
-        </w:rPr>
-        <w:t>And</w:t>
-      </w:r>
-      <w:proofErr w:type="gramEnd"/>
-      <w:r>
-        <w:rPr>
-          <w:b/>
-          <w:bCs/>
-        </w:rPr>
-        <w:t xml:space="preserve"> Eda Structure Masterplan Addendum</w:t>
+        <w:t>Visual Grammar And Eda Structure Masterplan Addendum</w:t>
       </w:r>
     </w:p>
     <w:p>
@@ -92,7 +76,7 @@
           <w:bCs/>
         </w:rPr>
         <w:pict w14:anchorId="1197AED7">
-          <v:rect id="_x0000_i1157" style="width:0;height:1.5pt" o:hralign="center" o:hrstd="t" o:hr="t" fillcolor="#a0a0a0" stroked="f"/>
+          <v:rect id="_x0000_i1025" style="width:0;height:1.5pt" o:hralign="center" o:hrstd="t" o:hr="t" fillcolor="#a0a0a0" stroked="f"/>
         </w:pict>
       </w:r>
     </w:p>
@@ -353,7 +337,7 @@
           <w:bCs/>
         </w:rPr>
         <w:pict w14:anchorId="031B1AC4">
-          <v:rect id="_x0000_i1158" style="width:0;height:1.5pt" o:hralign="center" o:hrstd="t" o:hr="t" fillcolor="#a0a0a0" stroked="f"/>
+          <v:rect id="_x0000_i1026" style="width:0;height:1.5pt" o:hralign="center" o:hrstd="t" o:hr="t" fillcolor="#a0a0a0" stroked="f"/>
         </w:pict>
       </w:r>
     </w:p>
@@ -686,7 +670,7 @@
           <w:bCs/>
         </w:rPr>
         <w:pict w14:anchorId="41DE8E92">
-          <v:rect id="_x0000_i1159" style="width:0;height:1.5pt" o:hralign="center" o:hrstd="t" o:hr="t" fillcolor="#a0a0a0" stroked="f"/>
+          <v:rect id="_x0000_i1027" style="width:0;height:1.5pt" o:hralign="center" o:hrstd="t" o:hr="t" fillcolor="#a0a0a0" stroked="f"/>
         </w:pict>
       </w:r>
     </w:p>
@@ -865,7 +849,7 @@
           <w:bCs/>
         </w:rPr>
         <w:pict w14:anchorId="121047D1">
-          <v:rect id="_x0000_i1160" style="width:0;height:1.5pt" o:hralign="center" o:hrstd="t" o:hr="t" fillcolor="#a0a0a0" stroked="f"/>
+          <v:rect id="_x0000_i1028" style="width:0;height:1.5pt" o:hralign="center" o:hrstd="t" o:hr="t" fillcolor="#a0a0a0" stroked="f"/>
         </w:pict>
       </w:r>
     </w:p>
@@ -1088,7 +1072,7 @@
           <w:bCs/>
         </w:rPr>
         <w:pict w14:anchorId="159FE010">
-          <v:rect id="_x0000_i1161" style="width:0;height:1.5pt" o:hralign="center" o:hrstd="t" o:hr="t" fillcolor="#a0a0a0" stroked="f"/>
+          <v:rect id="_x0000_i1029" style="width:0;height:1.5pt" o:hralign="center" o:hrstd="t" o:hr="t" fillcolor="#a0a0a0" stroked="f"/>
         </w:pict>
       </w:r>
     </w:p>
@@ -1319,7 +1303,7 @@
           <w:bCs/>
         </w:rPr>
         <w:pict w14:anchorId="31639610">
-          <v:rect id="_x0000_i1162" style="width:0;height:1.5pt" o:hralign="center" o:hrstd="t" o:hr="t" fillcolor="#a0a0a0" stroked="f"/>
+          <v:rect id="_x0000_i1030" style="width:0;height:1.5pt" o:hralign="center" o:hrstd="t" o:hr="t" fillcolor="#a0a0a0" stroked="f"/>
         </w:pict>
       </w:r>
     </w:p>
@@ -1542,7 +1526,7 @@
           <w:bCs/>
         </w:rPr>
         <w:pict w14:anchorId="5480ABE5">
-          <v:rect id="_x0000_i1163" style="width:0;height:1.5pt" o:hralign="center" o:hrstd="t" o:hr="t" fillcolor="#a0a0a0" stroked="f"/>
+          <v:rect id="_x0000_i1031" style="width:0;height:1.5pt" o:hralign="center" o:hrstd="t" o:hr="t" fillcolor="#a0a0a0" stroked="f"/>
         </w:pict>
       </w:r>
     </w:p>
@@ -1832,7 +1816,7 @@
           <w:bCs/>
         </w:rPr>
         <w:pict w14:anchorId="674F3FFD">
-          <v:rect id="_x0000_i1164" style="width:0;height:1.5pt" o:hralign="center" o:hrstd="t" o:hr="t" fillcolor="#a0a0a0" stroked="f"/>
+          <v:rect id="_x0000_i1032" style="width:0;height:1.5pt" o:hralign="center" o:hrstd="t" o:hr="t" fillcolor="#a0a0a0" stroked="f"/>
         </w:pict>
       </w:r>
     </w:p>
@@ -2474,7 +2458,7 @@
           <w:bCs/>
         </w:rPr>
         <w:pict w14:anchorId="6656B7E8">
-          <v:rect id="_x0000_i1165" style="width:0;height:1.5pt" o:hralign="center" o:hrstd="t" o:hr="t" fillcolor="#a0a0a0" stroked="f"/>
+          <v:rect id="_x0000_i1033" style="width:0;height:1.5pt" o:hralign="center" o:hrstd="t" o:hr="t" fillcolor="#a0a0a0" stroked="f"/>
         </w:pict>
       </w:r>
     </w:p>
@@ -2718,7 +2702,7 @@
           <w:bCs/>
         </w:rPr>
         <w:pict w14:anchorId="27DA27CF">
-          <v:rect id="_x0000_i1166" style="width:0;height:1.5pt" o:hralign="center" o:hrstd="t" o:hr="t" fillcolor="#a0a0a0" stroked="f"/>
+          <v:rect id="_x0000_i1034" style="width:0;height:1.5pt" o:hralign="center" o:hrstd="t" o:hr="t" fillcolor="#a0a0a0" stroked="f"/>
         </w:pict>
       </w:r>
     </w:p>
@@ -2923,7 +2907,7 @@
           <w:bCs/>
         </w:rPr>
         <w:pict w14:anchorId="7735F295">
-          <v:rect id="_x0000_i1167" style="width:0;height:1.5pt" o:hralign="center" o:hrstd="t" o:hr="t" fillcolor="#a0a0a0" stroked="f"/>
+          <v:rect id="_x0000_i1035" style="width:0;height:1.5pt" o:hralign="center" o:hrstd="t" o:hr="t" fillcolor="#a0a0a0" stroked="f"/>
         </w:pict>
       </w:r>
     </w:p>
@@ -3030,7 +3014,7 @@
           <w:bCs/>
         </w:rPr>
         <w:pict w14:anchorId="6BA83BC8">
-          <v:rect id="_x0000_i1168" style="width:0;height:1.5pt" o:hralign="center" o:hrstd="t" o:hr="t" fillcolor="#a0a0a0" stroked="f"/>
+          <v:rect id="_x0000_i1036" style="width:0;height:1.5pt" o:hralign="center" o:hrstd="t" o:hr="t" fillcolor="#a0a0a0" stroked="f"/>
         </w:pict>
       </w:r>
     </w:p>
@@ -3191,15 +3175,7 @@
           <w:b/>
           <w:bCs/>
         </w:rPr>
-        <w:t xml:space="preserve">light transparent </w:t>
-      </w:r>
-      <w:proofErr w:type="gramStart"/>
-      <w:r>
-        <w:rPr>
-          <w:b/>
-          <w:bCs/>
-        </w:rPr>
-        <w:t>blue-</w:t>
+        <w:t>light transparent blue-</w:t>
       </w:r>
       <w:proofErr w:type="spellStart"/>
       <w:r>
@@ -3210,7 +3186,6 @@
         <w:t>gray</w:t>
       </w:r>
       <w:proofErr w:type="spellEnd"/>
-      <w:proofErr w:type="gramEnd"/>
     </w:p>
     <w:p>
       <w:pPr>
@@ -3298,7 +3273,7 @@
           <w:bCs/>
         </w:rPr>
         <w:pict w14:anchorId="300A5906">
-          <v:rect id="_x0000_i1169" style="width:0;height:1.5pt" o:hralign="center" o:hrstd="t" o:hr="t" fillcolor="#a0a0a0" stroked="f"/>
+          <v:rect id="_x0000_i1037" style="width:0;height:1.5pt" o:hralign="center" o:hrstd="t" o:hr="t" fillcolor="#a0a0a0" stroked="f"/>
         </w:pict>
       </w:r>
     </w:p>
@@ -3538,7 +3513,7 @@
           <w:bCs/>
         </w:rPr>
         <w:pict w14:anchorId="18060E47">
-          <v:rect id="_x0000_i1170" style="width:0;height:1.5pt" o:hralign="center" o:hrstd="t" o:hr="t" fillcolor="#a0a0a0" stroked="f"/>
+          <v:rect id="_x0000_i1038" style="width:0;height:1.5pt" o:hralign="center" o:hrstd="t" o:hr="t" fillcolor="#a0a0a0" stroked="f"/>
         </w:pict>
       </w:r>
     </w:p>
@@ -3706,7 +3681,7 @@
           <w:bCs/>
         </w:rPr>
         <w:pict w14:anchorId="3B5E7E21">
-          <v:rect id="_x0000_i1171" style="width:0;height:1.5pt" o:hralign="center" o:hrstd="t" o:hr="t" fillcolor="#a0a0a0" stroked="f"/>
+          <v:rect id="_x0000_i1039" style="width:0;height:1.5pt" o:hralign="center" o:hrstd="t" o:hr="t" fillcolor="#a0a0a0" stroked="f"/>
         </w:pict>
       </w:r>
     </w:p>
@@ -4060,7 +4035,6 @@
                 <w:bCs/>
               </w:rPr>
             </w:pPr>
-            <w:proofErr w:type="gramStart"/>
             <w:r>
               <w:rPr>
                 <w:b/>
@@ -4068,7 +4042,6 @@
               </w:rPr>
               <w:t>yellow-orange</w:t>
             </w:r>
-            <w:proofErr w:type="gramEnd"/>
           </w:p>
         </w:tc>
       </w:tr>
@@ -4265,7 +4238,7 @@
           <w:bCs/>
         </w:rPr>
         <w:pict w14:anchorId="331984A4">
-          <v:rect id="_x0000_i1172" style="width:0;height:1.5pt" o:hralign="center" o:hrstd="t" o:hr="t" fillcolor="#a0a0a0" stroked="f"/>
+          <v:rect id="_x0000_i1040" style="width:0;height:1.5pt" o:hralign="center" o:hrstd="t" o:hr="t" fillcolor="#a0a0a0" stroked="f"/>
         </w:pict>
       </w:r>
     </w:p>
@@ -4434,7 +4407,7 @@
           <w:bCs/>
         </w:rPr>
         <w:pict w14:anchorId="75025A72">
-          <v:rect id="_x0000_i1173" style="width:0;height:1.5pt" o:hralign="center" o:hrstd="t" o:hr="t" fillcolor="#a0a0a0" stroked="f"/>
+          <v:rect id="_x0000_i1041" style="width:0;height:1.5pt" o:hralign="center" o:hrstd="t" o:hr="t" fillcolor="#a0a0a0" stroked="f"/>
         </w:pict>
       </w:r>
     </w:p>
@@ -4539,7 +4512,7 @@
           <w:bCs/>
         </w:rPr>
         <w:pict w14:anchorId="7654C391">
-          <v:rect id="_x0000_i1174" style="width:0;height:1.5pt" o:hralign="center" o:hrstd="t" o:hr="t" fillcolor="#a0a0a0" stroked="f"/>
+          <v:rect id="_x0000_i1042" style="width:0;height:1.5pt" o:hralign="center" o:hrstd="t" o:hr="t" fillcolor="#a0a0a0" stroked="f"/>
         </w:pict>
       </w:r>
     </w:p>
@@ -4779,7 +4752,7 @@
           <w:bCs/>
         </w:rPr>
         <w:pict w14:anchorId="2CDF9121">
-          <v:rect id="_x0000_i1175" style="width:0;height:1.5pt" o:hralign="center" o:hrstd="t" o:hr="t" fillcolor="#a0a0a0" stroked="f"/>
+          <v:rect id="_x0000_i1043" style="width:0;height:1.5pt" o:hralign="center" o:hrstd="t" o:hr="t" fillcolor="#a0a0a0" stroked="f"/>
         </w:pict>
       </w:r>
     </w:p>
@@ -4898,7 +4871,7 @@
           <w:bCs/>
         </w:rPr>
         <w:pict w14:anchorId="17CF77C8">
-          <v:rect id="_x0000_i1176" style="width:0;height:1.5pt" o:hralign="center" o:hrstd="t" o:hr="t" fillcolor="#a0a0a0" stroked="f"/>
+          <v:rect id="_x0000_i1044" style="width:0;height:1.5pt" o:hralign="center" o:hrstd="t" o:hr="t" fillcolor="#a0a0a0" stroked="f"/>
         </w:pict>
       </w:r>
     </w:p>
@@ -5037,7 +5010,7 @@
           <w:bCs/>
         </w:rPr>
         <w:pict w14:anchorId="0D32F080">
-          <v:rect id="_x0000_i1177" style="width:0;height:1.5pt" o:hralign="center" o:hrstd="t" o:hr="t" fillcolor="#a0a0a0" stroked="f"/>
+          <v:rect id="_x0000_i1045" style="width:0;height:1.5pt" o:hralign="center" o:hrstd="t" o:hr="t" fillcolor="#a0a0a0" stroked="f"/>
         </w:pict>
       </w:r>
     </w:p>
@@ -5137,7 +5110,7 @@
           <w:bCs/>
         </w:rPr>
         <w:pict w14:anchorId="764124DB">
-          <v:rect id="_x0000_i1178" style="width:0;height:1.5pt" o:hralign="center" o:hrstd="t" o:hr="t" fillcolor="#a0a0a0" stroked="f"/>
+          <v:rect id="_x0000_i1046" style="width:0;height:1.5pt" o:hralign="center" o:hrstd="t" o:hr="t" fillcolor="#a0a0a0" stroked="f"/>
         </w:pict>
       </w:r>
     </w:p>
@@ -5344,23 +5317,7 @@
           <w:b/>
           <w:bCs/>
         </w:rPr>
-        <w:t xml:space="preserve">and </w:t>
-      </w:r>
-      <w:proofErr w:type="gramStart"/>
-      <w:r>
-        <w:rPr>
-          <w:b/>
-          <w:bCs/>
-        </w:rPr>
-        <w:t>evidence-gated</w:t>
-      </w:r>
-      <w:proofErr w:type="gramEnd"/>
-      <w:r>
-        <w:rPr>
-          <w:b/>
-          <w:bCs/>
-        </w:rPr>
-        <w:t>.</w:t>
+        <w:t>and evidence-gated.</w:t>
       </w:r>
     </w:p>
     <w:p>
@@ -5521,6 +5478,4556 @@
           <w:bCs/>
         </w:rPr>
       </w:pPr>
+    </w:p>
+    <w:p>
+      <w:pPr>
+        <w:rPr>
+          <w:b/>
+          <w:bCs/>
+          <w:lang w:val="en-IL"/>
+        </w:rPr>
+      </w:pPr>
+      <w:r>
+        <w:rPr>
+          <w:b/>
+          <w:bCs/>
+          <w:lang w:val="en-IL"/>
+        </w:rPr>
+        <w:t>PAGE 1 — COUNTRY EXPLORER (UX &amp; VISUAL ARCHITECTURE FREEZE)</w:t>
+      </w:r>
+    </w:p>
+    <w:p>
+      <w:pPr>
+        <w:rPr>
+          <w:b/>
+          <w:bCs/>
+          <w:lang w:val="en-IL"/>
+        </w:rPr>
+      </w:pPr>
+      <w:r>
+        <w:rPr>
+          <w:b/>
+          <w:bCs/>
+          <w:lang w:val="en-IL"/>
+        </w:rPr>
+        <w:t>Purpose</w:t>
+      </w:r>
+    </w:p>
+    <w:p>
+      <w:pPr>
+        <w:rPr>
+          <w:b/>
+          <w:bCs/>
+          <w:lang w:val="en-IL"/>
+        </w:rPr>
+      </w:pPr>
+      <w:r>
+        <w:rPr>
+          <w:b/>
+          <w:bCs/>
+          <w:lang w:val="en-IL"/>
+        </w:rPr>
+        <w:t>The Country Explorer is the first true exploration page of the application.</w:t>
+      </w:r>
+    </w:p>
+    <w:p>
+      <w:pPr>
+        <w:rPr>
+          <w:b/>
+          <w:bCs/>
+          <w:lang w:val="en-IL"/>
+        </w:rPr>
+      </w:pPr>
+      <w:r>
+        <w:rPr>
+          <w:b/>
+          <w:bCs/>
+          <w:lang w:val="en-IL"/>
+        </w:rPr>
+        <w:t>Its purpose is not to display data.</w:t>
+      </w:r>
+    </w:p>
+    <w:p>
+      <w:pPr>
+        <w:rPr>
+          <w:b/>
+          <w:bCs/>
+          <w:lang w:val="en-IL"/>
+        </w:rPr>
+      </w:pPr>
+      <w:r>
+        <w:rPr>
+          <w:b/>
+          <w:bCs/>
+          <w:lang w:val="en-IL"/>
+        </w:rPr>
+        <w:t>Its purpose is to help users answer:</w:t>
+      </w:r>
+    </w:p>
+    <w:p>
+      <w:pPr>
+        <w:rPr>
+          <w:b/>
+          <w:bCs/>
+          <w:lang w:val="en-IL"/>
+        </w:rPr>
+      </w:pPr>
+      <w:r>
+        <w:rPr>
+          <w:b/>
+          <w:bCs/>
+          <w:lang w:val="en-IL"/>
+        </w:rPr>
+        <w:t>Who is this country?</w:t>
+      </w:r>
+    </w:p>
+    <w:p>
+      <w:pPr>
+        <w:rPr>
+          <w:b/>
+          <w:bCs/>
+          <w:lang w:val="en-IL"/>
+        </w:rPr>
+      </w:pPr>
+      <w:r>
+        <w:rPr>
+          <w:b/>
+          <w:bCs/>
+          <w:lang w:val="en-IL"/>
+        </w:rPr>
+        <w:t>Why is it positioned here?</w:t>
+      </w:r>
+    </w:p>
+    <w:p>
+      <w:pPr>
+        <w:rPr>
+          <w:b/>
+          <w:bCs/>
+          <w:lang w:val="en-IL"/>
+        </w:rPr>
+      </w:pPr>
+      <w:r>
+        <w:rPr>
+          <w:b/>
+          <w:bCs/>
+          <w:lang w:val="en-IL"/>
+        </w:rPr>
+        <w:t>How has it evolved?</w:t>
+      </w:r>
+    </w:p>
+    <w:p>
+      <w:pPr>
+        <w:rPr>
+          <w:b/>
+          <w:bCs/>
+          <w:lang w:val="en-IL"/>
+        </w:rPr>
+      </w:pPr>
+      <w:r>
+        <w:rPr>
+          <w:b/>
+          <w:bCs/>
+          <w:lang w:val="en-IL"/>
+        </w:rPr>
+        <w:t>How does it compare to Europe and its peers?</w:t>
+      </w:r>
+    </w:p>
+    <w:p>
+      <w:pPr>
+        <w:rPr>
+          <w:b/>
+          <w:bCs/>
+          <w:lang w:val="en-IL"/>
+        </w:rPr>
+      </w:pPr>
+      <w:r>
+        <w:rPr>
+          <w:b/>
+          <w:bCs/>
+          <w:lang w:val="en-IL"/>
+        </w:rPr>
+        <w:t>The page should feel like:</w:t>
+      </w:r>
+    </w:p>
+    <w:p>
+      <w:pPr>
+        <w:rPr>
+          <w:b/>
+          <w:bCs/>
+          <w:lang w:val="en-IL"/>
+        </w:rPr>
+      </w:pPr>
+      <w:r>
+        <w:rPr>
+          <w:b/>
+          <w:bCs/>
+          <w:lang w:val="en-IL"/>
+        </w:rPr>
+        <w:t>Interactive Atlas</w:t>
+      </w:r>
+    </w:p>
+    <w:p>
+      <w:pPr>
+        <w:rPr>
+          <w:b/>
+          <w:bCs/>
+          <w:lang w:val="en-IL"/>
+        </w:rPr>
+      </w:pPr>
+      <w:r>
+        <w:rPr>
+          <w:b/>
+          <w:bCs/>
+          <w:lang w:val="en-IL"/>
+        </w:rPr>
+        <w:t>+</w:t>
+      </w:r>
+    </w:p>
+    <w:p>
+      <w:pPr>
+        <w:rPr>
+          <w:b/>
+          <w:bCs/>
+          <w:lang w:val="en-IL"/>
+        </w:rPr>
+      </w:pPr>
+      <w:r>
+        <w:rPr>
+          <w:b/>
+          <w:bCs/>
+          <w:lang w:val="en-IL"/>
+        </w:rPr>
+        <w:t>Guided Discovery</w:t>
+      </w:r>
+    </w:p>
+    <w:p>
+      <w:pPr>
+        <w:rPr>
+          <w:b/>
+          <w:bCs/>
+          <w:lang w:val="en-IL"/>
+        </w:rPr>
+      </w:pPr>
+      <w:r>
+        <w:rPr>
+          <w:b/>
+          <w:bCs/>
+          <w:lang w:val="en-IL"/>
+        </w:rPr>
+        <w:t>+</w:t>
+      </w:r>
+    </w:p>
+    <w:p>
+      <w:pPr>
+        <w:rPr>
+          <w:b/>
+          <w:bCs/>
+          <w:lang w:val="en-IL"/>
+        </w:rPr>
+      </w:pPr>
+      <w:r>
+        <w:rPr>
+          <w:b/>
+          <w:bCs/>
+          <w:lang w:val="en-IL"/>
+        </w:rPr>
+        <w:t>Country Story</w:t>
+      </w:r>
+    </w:p>
+    <w:p>
+      <w:pPr>
+        <w:rPr>
+          <w:b/>
+          <w:bCs/>
+          <w:lang w:val="en-IL"/>
+        </w:rPr>
+      </w:pPr>
+      <w:r>
+        <w:rPr>
+          <w:b/>
+          <w:bCs/>
+          <w:lang w:val="en-IL"/>
+        </w:rPr>
+        <w:t>NOT:</w:t>
+      </w:r>
+    </w:p>
+    <w:p>
+      <w:pPr>
+        <w:rPr>
+          <w:b/>
+          <w:bCs/>
+          <w:lang w:val="en-IL"/>
+        </w:rPr>
+      </w:pPr>
+      <w:r>
+        <w:rPr>
+          <w:b/>
+          <w:bCs/>
+          <w:lang w:val="en-IL"/>
+        </w:rPr>
+        <w:t>Country Dashboard</w:t>
+      </w:r>
+    </w:p>
+    <w:p>
+      <w:pPr>
+        <w:rPr>
+          <w:b/>
+          <w:bCs/>
+          <w:lang w:val="en-IL"/>
+        </w:rPr>
+      </w:pPr>
+      <w:r>
+        <w:rPr>
+          <w:b/>
+          <w:bCs/>
+          <w:lang w:val="en-IL"/>
+        </w:rPr>
+        <w:t xml:space="preserve">The user should leave the page with a clear mental model of the selected country before moving into </w:t>
+      </w:r>
+      <w:proofErr w:type="spellStart"/>
+      <w:r>
+        <w:rPr>
+          <w:b/>
+          <w:bCs/>
+          <w:lang w:val="en-IL"/>
+        </w:rPr>
+        <w:t>tradeoff</w:t>
+      </w:r>
+      <w:proofErr w:type="spellEnd"/>
+      <w:r>
+        <w:rPr>
+          <w:b/>
+          <w:bCs/>
+          <w:lang w:val="en-IL"/>
+        </w:rPr>
+        <w:t xml:space="preserve"> analysis.</w:t>
+      </w:r>
+    </w:p>
+    <w:p>
+      <w:pPr>
+        <w:rPr>
+          <w:b/>
+          <w:bCs/>
+          <w:lang w:val="en-IL"/>
+        </w:rPr>
+      </w:pPr>
+      <w:r>
+        <w:rPr>
+          <w:b/>
+          <w:bCs/>
+          <w:lang w:val="en-IL"/>
+        </w:rPr>
+        <w:pict w14:anchorId="49E04F68">
+          <v:rect id="_x0000_i1203" style="width:0;height:1.5pt" o:hralign="center" o:hrstd="t" o:hr="t" fillcolor="#a0a0a0" stroked="f"/>
+        </w:pict>
+      </w:r>
+    </w:p>
+    <w:p>
+      <w:pPr>
+        <w:rPr>
+          <w:b/>
+          <w:bCs/>
+          <w:lang w:val="en-IL"/>
+        </w:rPr>
+      </w:pPr>
+      <w:r>
+        <w:rPr>
+          <w:b/>
+          <w:bCs/>
+          <w:lang w:val="en-IL"/>
+        </w:rPr>
+        <w:t>Core Question</w:t>
+      </w:r>
+    </w:p>
+    <w:p>
+      <w:pPr>
+        <w:rPr>
+          <w:b/>
+          <w:bCs/>
+          <w:lang w:val="en-IL"/>
+        </w:rPr>
+      </w:pPr>
+      <w:r>
+        <w:rPr>
+          <w:b/>
+          <w:bCs/>
+          <w:lang w:val="en-IL"/>
+        </w:rPr>
+        <w:t>Displayed prominently at the top:</w:t>
+      </w:r>
+    </w:p>
+    <w:p>
+      <w:pPr>
+        <w:rPr>
+          <w:b/>
+          <w:bCs/>
+          <w:lang w:val="en-IL"/>
+        </w:rPr>
+      </w:pPr>
+      <w:r>
+        <w:rPr>
+          <w:b/>
+          <w:bCs/>
+          <w:lang w:val="en-IL"/>
+        </w:rPr>
+        <w:t>What makes Germany unique?</w:t>
+      </w:r>
+    </w:p>
+    <w:p>
+      <w:pPr>
+        <w:rPr>
+          <w:b/>
+          <w:bCs/>
+          <w:lang w:val="en-IL"/>
+        </w:rPr>
+      </w:pPr>
+      <w:r>
+        <w:rPr>
+          <w:b/>
+          <w:bCs/>
+          <w:lang w:val="en-IL"/>
+        </w:rPr>
+        <w:t>(or selected country)</w:t>
+      </w:r>
+    </w:p>
+    <w:p>
+      <w:pPr>
+        <w:rPr>
+          <w:b/>
+          <w:bCs/>
+          <w:lang w:val="en-IL"/>
+        </w:rPr>
+      </w:pPr>
+      <w:r>
+        <w:rPr>
+          <w:b/>
+          <w:bCs/>
+          <w:lang w:val="en-IL"/>
+        </w:rPr>
+        <w:t>The page is organized around answering this question.</w:t>
+      </w:r>
+    </w:p>
+    <w:p>
+      <w:pPr>
+        <w:rPr>
+          <w:b/>
+          <w:bCs/>
+          <w:lang w:val="en-IL"/>
+        </w:rPr>
+      </w:pPr>
+      <w:r>
+        <w:rPr>
+          <w:b/>
+          <w:bCs/>
+          <w:lang w:val="en-IL"/>
+        </w:rPr>
+        <w:pict w14:anchorId="3D5336ED">
+          <v:rect id="_x0000_i1204" style="width:0;height:1.5pt" o:hralign="center" o:hrstd="t" o:hr="t" fillcolor="#a0a0a0" stroked="f"/>
+        </w:pict>
+      </w:r>
+    </w:p>
+    <w:p>
+      <w:pPr>
+        <w:rPr>
+          <w:b/>
+          <w:bCs/>
+          <w:lang w:val="en-IL"/>
+        </w:rPr>
+      </w:pPr>
+      <w:r>
+        <w:rPr>
+          <w:b/>
+          <w:bCs/>
+          <w:lang w:val="en-IL"/>
+        </w:rPr>
+        <w:lastRenderedPageBreak/>
+        <w:t>Educational Goal</w:t>
+      </w:r>
+    </w:p>
+    <w:p>
+      <w:pPr>
+        <w:rPr>
+          <w:b/>
+          <w:bCs/>
+          <w:lang w:val="en-IL"/>
+        </w:rPr>
+      </w:pPr>
+      <w:r>
+        <w:rPr>
+          <w:b/>
+          <w:bCs/>
+          <w:lang w:val="en-IL"/>
+        </w:rPr>
+        <w:t>The user should gradually build understanding through:</w:t>
+      </w:r>
+    </w:p>
+    <w:p>
+      <w:pPr>
+        <w:rPr>
+          <w:b/>
+          <w:bCs/>
+          <w:lang w:val="en-IL"/>
+        </w:rPr>
+      </w:pPr>
+      <w:r>
+        <w:rPr>
+          <w:b/>
+          <w:bCs/>
+          <w:lang w:val="en-IL"/>
+        </w:rPr>
+        <w:t>Discovery</w:t>
+      </w:r>
+    </w:p>
+    <w:p>
+      <w:pPr>
+        <w:rPr>
+          <w:b/>
+          <w:bCs/>
+          <w:lang w:val="en-IL"/>
+        </w:rPr>
+      </w:pPr>
+      <w:r>
+        <w:rPr>
+          <w:b/>
+          <w:bCs/>
+          <w:lang w:val="en-IL"/>
+        </w:rPr>
+        <w:t>→ Context</w:t>
+      </w:r>
+    </w:p>
+    <w:p>
+      <w:pPr>
+        <w:rPr>
+          <w:b/>
+          <w:bCs/>
+          <w:lang w:val="en-IL"/>
+        </w:rPr>
+      </w:pPr>
+      <w:r>
+        <w:rPr>
+          <w:b/>
+          <w:bCs/>
+          <w:lang w:val="en-IL"/>
+        </w:rPr>
+        <w:t>→ Evolution</w:t>
+      </w:r>
+    </w:p>
+    <w:p>
+      <w:pPr>
+        <w:rPr>
+          <w:b/>
+          <w:bCs/>
+          <w:lang w:val="en-IL"/>
+        </w:rPr>
+      </w:pPr>
+      <w:r>
+        <w:rPr>
+          <w:b/>
+          <w:bCs/>
+          <w:lang w:val="en-IL"/>
+        </w:rPr>
+        <w:t>→ Comparison</w:t>
+      </w:r>
+    </w:p>
+    <w:p>
+      <w:pPr>
+        <w:rPr>
+          <w:b/>
+          <w:bCs/>
+          <w:lang w:val="en-IL"/>
+        </w:rPr>
+      </w:pPr>
+      <w:r>
+        <w:rPr>
+          <w:b/>
+          <w:bCs/>
+          <w:lang w:val="en-IL"/>
+        </w:rPr>
+        <w:t>→ Questions</w:t>
+      </w:r>
+    </w:p>
+    <w:p>
+      <w:pPr>
+        <w:rPr>
+          <w:b/>
+          <w:bCs/>
+          <w:lang w:val="en-IL"/>
+        </w:rPr>
+      </w:pPr>
+      <w:r>
+        <w:rPr>
+          <w:b/>
+          <w:bCs/>
+          <w:lang w:val="en-IL"/>
+        </w:rPr>
+        <w:t>→ Investigation</w:t>
+      </w:r>
+    </w:p>
+    <w:p>
+      <w:pPr>
+        <w:rPr>
+          <w:b/>
+          <w:bCs/>
+          <w:lang w:val="en-IL"/>
+        </w:rPr>
+      </w:pPr>
+      <w:r>
+        <w:rPr>
+          <w:b/>
+          <w:bCs/>
+          <w:lang w:val="en-IL"/>
+        </w:rPr>
+        <w:t>rather than:</w:t>
+      </w:r>
+    </w:p>
+    <w:p>
+      <w:pPr>
+        <w:rPr>
+          <w:b/>
+          <w:bCs/>
+          <w:lang w:val="en-IL"/>
+        </w:rPr>
+      </w:pPr>
+      <w:r>
+        <w:rPr>
+          <w:b/>
+          <w:bCs/>
+          <w:lang w:val="en-IL"/>
+        </w:rPr>
+        <w:t>Filters</w:t>
+      </w:r>
+    </w:p>
+    <w:p>
+      <w:pPr>
+        <w:rPr>
+          <w:b/>
+          <w:bCs/>
+          <w:lang w:val="en-IL"/>
+        </w:rPr>
+      </w:pPr>
+      <w:r>
+        <w:rPr>
+          <w:b/>
+          <w:bCs/>
+          <w:lang w:val="en-IL"/>
+        </w:rPr>
+        <w:t>→ Charts</w:t>
+      </w:r>
+    </w:p>
+    <w:p>
+      <w:pPr>
+        <w:rPr>
+          <w:b/>
+          <w:bCs/>
+          <w:lang w:val="en-IL"/>
+        </w:rPr>
+      </w:pPr>
+      <w:r>
+        <w:rPr>
+          <w:b/>
+          <w:bCs/>
+          <w:lang w:val="en-IL"/>
+        </w:rPr>
+        <w:t>→ Tables</w:t>
+      </w:r>
+    </w:p>
+    <w:p>
+      <w:pPr>
+        <w:rPr>
+          <w:b/>
+          <w:bCs/>
+          <w:lang w:val="en-IL"/>
+        </w:rPr>
+      </w:pPr>
+      <w:r>
+        <w:rPr>
+          <w:b/>
+          <w:bCs/>
+          <w:lang w:val="en-IL"/>
+        </w:rPr>
+        <w:pict w14:anchorId="3C6EFC63">
+          <v:rect id="_x0000_i1205" style="width:0;height:1.5pt" o:hralign="center" o:hrstd="t" o:hr="t" fillcolor="#a0a0a0" stroked="f"/>
+        </w:pict>
+      </w:r>
+    </w:p>
+    <w:p>
+      <w:pPr>
+        <w:rPr>
+          <w:b/>
+          <w:bCs/>
+          <w:lang w:val="en-IL"/>
+        </w:rPr>
+      </w:pPr>
+      <w:r>
+        <w:rPr>
+          <w:b/>
+          <w:bCs/>
+          <w:lang w:val="en-IL"/>
+        </w:rPr>
+        <w:t>Page Layout</w:t>
+      </w:r>
+    </w:p>
+    <w:p>
+      <w:pPr>
+        <w:rPr>
+          <w:b/>
+          <w:bCs/>
+          <w:lang w:val="en-IL"/>
+        </w:rPr>
+      </w:pPr>
+      <w:r>
+        <w:rPr>
+          <w:b/>
+          <w:bCs/>
+          <w:lang w:val="en-IL"/>
+        </w:rPr>
+        <w:t>SECTION 1 — Hero Discovery Area</w:t>
+      </w:r>
+    </w:p>
+    <w:p>
+      <w:pPr>
+        <w:rPr>
+          <w:b/>
+          <w:bCs/>
+          <w:lang w:val="en-IL"/>
+        </w:rPr>
+      </w:pPr>
+      <w:r>
+        <w:rPr>
+          <w:b/>
+          <w:bCs/>
+          <w:lang w:val="en-IL"/>
+        </w:rPr>
+        <w:t>Main Visual</w:t>
+      </w:r>
+    </w:p>
+    <w:p>
+      <w:pPr>
+        <w:rPr>
+          <w:b/>
+          <w:bCs/>
+          <w:lang w:val="en-IL"/>
+        </w:rPr>
+      </w:pPr>
+      <w:r>
+        <w:rPr>
+          <w:b/>
+          <w:bCs/>
+          <w:lang w:val="en-IL"/>
+        </w:rPr>
+        <w:t>Large Europe map.</w:t>
+      </w:r>
+    </w:p>
+    <w:p>
+      <w:pPr>
+        <w:rPr>
+          <w:b/>
+          <w:bCs/>
+          <w:lang w:val="en-IL"/>
+        </w:rPr>
+      </w:pPr>
+      <w:r>
+        <w:rPr>
+          <w:b/>
+          <w:bCs/>
+          <w:lang w:val="en-IL"/>
+        </w:rPr>
+        <w:t>Selected country highlighted.</w:t>
+      </w:r>
+    </w:p>
+    <w:p>
+      <w:pPr>
+        <w:rPr>
+          <w:b/>
+          <w:bCs/>
+          <w:lang w:val="en-IL"/>
+        </w:rPr>
+      </w:pPr>
+      <w:r>
+        <w:rPr>
+          <w:b/>
+          <w:bCs/>
+          <w:lang w:val="en-IL"/>
+        </w:rPr>
+        <w:t>Europe remains visible.</w:t>
+      </w:r>
+    </w:p>
+    <w:p>
+      <w:pPr>
+        <w:rPr>
+          <w:b/>
+          <w:bCs/>
+          <w:lang w:val="en-IL"/>
+        </w:rPr>
+      </w:pPr>
+      <w:r>
+        <w:rPr>
+          <w:b/>
+          <w:bCs/>
+          <w:lang w:val="en-IL"/>
+        </w:rPr>
+        <w:t>Reason:</w:t>
+      </w:r>
+    </w:p>
+    <w:p>
+      <w:pPr>
+        <w:rPr>
+          <w:b/>
+          <w:bCs/>
+          <w:lang w:val="en-IL"/>
+        </w:rPr>
+      </w:pPr>
+      <w:r>
+        <w:rPr>
+          <w:b/>
+          <w:bCs/>
+          <w:lang w:val="en-IL"/>
+        </w:rPr>
+        <w:t>Users should immediately understand:</w:t>
+      </w:r>
+    </w:p>
+    <w:p>
+      <w:pPr>
+        <w:rPr>
+          <w:b/>
+          <w:bCs/>
+          <w:lang w:val="en-IL"/>
+        </w:rPr>
+      </w:pPr>
+      <w:r>
+        <w:rPr>
+          <w:b/>
+          <w:bCs/>
+          <w:lang w:val="en-IL"/>
+        </w:rPr>
+        <w:t>Country</w:t>
+      </w:r>
+    </w:p>
+    <w:p>
+      <w:pPr>
+        <w:rPr>
+          <w:b/>
+          <w:bCs/>
+          <w:lang w:val="en-IL"/>
+        </w:rPr>
+      </w:pPr>
+      <w:r>
+        <w:rPr>
+          <w:b/>
+          <w:bCs/>
+          <w:lang w:val="en-IL"/>
+        </w:rPr>
+        <w:t>inside</w:t>
+      </w:r>
+    </w:p>
+    <w:p>
+      <w:pPr>
+        <w:rPr>
+          <w:b/>
+          <w:bCs/>
+          <w:lang w:val="en-IL"/>
+        </w:rPr>
+      </w:pPr>
+      <w:r>
+        <w:rPr>
+          <w:b/>
+          <w:bCs/>
+          <w:lang w:val="en-IL"/>
+        </w:rPr>
+        <w:t>Europe</w:t>
+      </w:r>
+    </w:p>
+    <w:p>
+      <w:pPr>
+        <w:rPr>
+          <w:b/>
+          <w:bCs/>
+          <w:lang w:val="en-IL"/>
+        </w:rPr>
+      </w:pPr>
+      <w:r>
+        <w:rPr>
+          <w:b/>
+          <w:bCs/>
+          <w:lang w:val="en-IL"/>
+        </w:rPr>
+        <w:t>rather than viewing the country in isolation.</w:t>
+      </w:r>
+    </w:p>
+    <w:p>
+      <w:pPr>
+        <w:rPr>
+          <w:b/>
+          <w:bCs/>
+          <w:lang w:val="en-IL"/>
+        </w:rPr>
+      </w:pPr>
+      <w:r>
+        <w:rPr>
+          <w:b/>
+          <w:bCs/>
+          <w:lang w:val="en-IL"/>
+        </w:rPr>
+        <w:pict w14:anchorId="08D53716">
+          <v:rect id="_x0000_i1206" style="width:0;height:1.5pt" o:hralign="center" o:hrstd="t" o:hr="t" fillcolor="#a0a0a0" stroked="f"/>
+        </w:pict>
+      </w:r>
+    </w:p>
+    <w:p>
+      <w:pPr>
+        <w:rPr>
+          <w:b/>
+          <w:bCs/>
+          <w:lang w:val="en-IL"/>
+        </w:rPr>
+      </w:pPr>
+      <w:r>
+        <w:rPr>
+          <w:b/>
+          <w:bCs/>
+          <w:lang w:val="en-IL"/>
+        </w:rPr>
+        <w:t>Compare Context</w:t>
+      </w:r>
+    </w:p>
+    <w:p>
+      <w:pPr>
+        <w:rPr>
+          <w:b/>
+          <w:bCs/>
+          <w:lang w:val="en-IL"/>
+        </w:rPr>
+      </w:pPr>
+      <w:r>
+        <w:rPr>
+          <w:b/>
+          <w:bCs/>
+          <w:lang w:val="en-IL"/>
+        </w:rPr>
+        <w:t>Directly visible:</w:t>
+      </w:r>
+    </w:p>
+    <w:p>
+      <w:pPr>
+        <w:rPr>
+          <w:b/>
+          <w:bCs/>
+          <w:lang w:val="en-IL"/>
+        </w:rPr>
+      </w:pPr>
+      <w:r>
+        <w:rPr>
+          <w:b/>
+          <w:bCs/>
+          <w:lang w:val="en-IL"/>
+        </w:rPr>
+        <w:lastRenderedPageBreak/>
+        <w:t>Compare To:</w:t>
+      </w:r>
+    </w:p>
+    <w:p>
+      <w:pPr>
+        <w:rPr>
+          <w:b/>
+          <w:bCs/>
+          <w:lang w:val="en-IL"/>
+        </w:rPr>
+      </w:pPr>
+    </w:p>
+    <w:p>
+      <w:pPr>
+        <w:rPr>
+          <w:b/>
+          <w:bCs/>
+          <w:lang w:val="en-IL"/>
+        </w:rPr>
+      </w:pPr>
+      <w:r>
+        <w:rPr>
+          <w:b/>
+          <w:bCs/>
+          <w:lang w:val="en-IL"/>
+        </w:rPr>
+        <w:t>○ EU Average</w:t>
+      </w:r>
+    </w:p>
+    <w:p>
+      <w:pPr>
+        <w:rPr>
+          <w:b/>
+          <w:bCs/>
+          <w:lang w:val="en-IL"/>
+        </w:rPr>
+      </w:pPr>
+      <w:r>
+        <w:rPr>
+          <w:b/>
+          <w:bCs/>
+          <w:lang w:val="en-IL"/>
+        </w:rPr>
+        <w:t>○ Family Average</w:t>
+      </w:r>
+    </w:p>
+    <w:p>
+      <w:pPr>
+        <w:rPr>
+          <w:b/>
+          <w:bCs/>
+          <w:lang w:val="en-IL"/>
+        </w:rPr>
+      </w:pPr>
+      <w:r>
+        <w:rPr>
+          <w:b/>
+          <w:bCs/>
+          <w:lang w:val="en-IL"/>
+        </w:rPr>
+        <w:t>○ Sweden</w:t>
+      </w:r>
+    </w:p>
+    <w:p>
+      <w:pPr>
+        <w:rPr>
+          <w:b/>
+          <w:bCs/>
+          <w:lang w:val="en-IL"/>
+        </w:rPr>
+      </w:pPr>
+      <w:r>
+        <w:rPr>
+          <w:b/>
+          <w:bCs/>
+          <w:lang w:val="en-IL"/>
+        </w:rPr>
+        <w:t>○ Another Country</w:t>
+      </w:r>
+    </w:p>
+    <w:p>
+      <w:pPr>
+        <w:rPr>
+          <w:b/>
+          <w:bCs/>
+          <w:lang w:val="en-IL"/>
+        </w:rPr>
+      </w:pPr>
+      <w:r>
+        <w:rPr>
+          <w:b/>
+          <w:bCs/>
+          <w:lang w:val="en-IL"/>
+        </w:rPr>
+        <w:t>Comparison should be available immediately.</w:t>
+      </w:r>
+    </w:p>
+    <w:p>
+      <w:pPr>
+        <w:rPr>
+          <w:b/>
+          <w:bCs/>
+          <w:lang w:val="en-IL"/>
+        </w:rPr>
+      </w:pPr>
+      <w:r>
+        <w:rPr>
+          <w:b/>
+          <w:bCs/>
+          <w:lang w:val="en-IL"/>
+        </w:rPr>
+        <w:t>Not hidden.</w:t>
+      </w:r>
+    </w:p>
+    <w:p>
+      <w:pPr>
+        <w:rPr>
+          <w:b/>
+          <w:bCs/>
+          <w:lang w:val="en-IL"/>
+        </w:rPr>
+      </w:pPr>
+      <w:r>
+        <w:rPr>
+          <w:b/>
+          <w:bCs/>
+          <w:lang w:val="en-IL"/>
+        </w:rPr>
+        <w:pict w14:anchorId="76AF07A7">
+          <v:rect id="_x0000_i1207" style="width:0;height:1.5pt" o:hralign="center" o:hrstd="t" o:hr="t" fillcolor="#a0a0a0" stroked="f"/>
+        </w:pict>
+      </w:r>
+    </w:p>
+    <w:p>
+      <w:pPr>
+        <w:rPr>
+          <w:b/>
+          <w:bCs/>
+          <w:lang w:val="en-IL"/>
+        </w:rPr>
+      </w:pPr>
+      <w:r>
+        <w:rPr>
+          <w:b/>
+          <w:bCs/>
+          <w:lang w:val="en-IL"/>
+        </w:rPr>
+        <w:t>Discovery Card</w:t>
+      </w:r>
+    </w:p>
+    <w:p>
+      <w:pPr>
+        <w:rPr>
+          <w:b/>
+          <w:bCs/>
+          <w:lang w:val="en-IL"/>
+        </w:rPr>
+      </w:pPr>
+      <w:r>
+        <w:rPr>
+          <w:b/>
+          <w:bCs/>
+          <w:lang w:val="en-IL"/>
+        </w:rPr>
+        <w:t>Example:</w:t>
+      </w:r>
+    </w:p>
+    <w:p>
+      <w:pPr>
+        <w:rPr>
+          <w:b/>
+          <w:bCs/>
+          <w:lang w:val="en-IL"/>
+        </w:rPr>
+      </w:pPr>
+      <w:r>
+        <w:rPr>
+          <w:b/>
+          <w:bCs/>
+          <w:lang w:val="en-IL"/>
+        </w:rPr>
+        <w:t>You discovered:</w:t>
+      </w:r>
+    </w:p>
+    <w:p>
+      <w:pPr>
+        <w:rPr>
+          <w:b/>
+          <w:bCs/>
+          <w:lang w:val="en-IL"/>
+        </w:rPr>
+      </w:pPr>
+    </w:p>
+    <w:p>
+      <w:pPr>
+        <w:rPr>
+          <w:b/>
+          <w:bCs/>
+          <w:lang w:val="en-IL"/>
+        </w:rPr>
+      </w:pPr>
+      <w:r>
+        <w:rPr>
+          <w:b/>
+          <w:bCs/>
+          <w:lang w:val="en-IL"/>
+        </w:rPr>
+        <w:t>Germany belongs to the Innovation Core Family.</w:t>
+      </w:r>
+    </w:p>
+    <w:p>
+      <w:pPr>
+        <w:rPr>
+          <w:b/>
+          <w:bCs/>
+          <w:lang w:val="en-IL"/>
+        </w:rPr>
+      </w:pPr>
+      <w:r>
+        <w:rPr>
+          <w:b/>
+          <w:bCs/>
+          <w:lang w:val="en-IL"/>
+        </w:rPr>
+        <w:t>Followed by:</w:t>
+      </w:r>
+    </w:p>
+    <w:p>
+      <w:pPr>
+        <w:rPr>
+          <w:b/>
+          <w:bCs/>
+          <w:lang w:val="en-IL"/>
+        </w:rPr>
+      </w:pPr>
+      <w:r>
+        <w:rPr>
+          <w:b/>
+          <w:bCs/>
+          <w:lang w:val="en-IL"/>
+        </w:rPr>
+        <w:t>High innovation capacity,</w:t>
+      </w:r>
+    </w:p>
+    <w:p>
+      <w:pPr>
+        <w:rPr>
+          <w:b/>
+          <w:bCs/>
+          <w:lang w:val="en-IL"/>
+        </w:rPr>
+      </w:pPr>
+      <w:r>
+        <w:rPr>
+          <w:b/>
+          <w:bCs/>
+          <w:lang w:val="en-IL"/>
+        </w:rPr>
+        <w:t>strong institutions,</w:t>
+      </w:r>
+    </w:p>
+    <w:p>
+      <w:pPr>
+        <w:rPr>
+          <w:b/>
+          <w:bCs/>
+          <w:lang w:val="en-IL"/>
+        </w:rPr>
+      </w:pPr>
+      <w:r>
+        <w:rPr>
+          <w:b/>
+          <w:bCs/>
+          <w:lang w:val="en-IL"/>
+        </w:rPr>
+        <w:t>industrial leadership.</w:t>
+      </w:r>
+    </w:p>
+    <w:p>
+      <w:pPr>
+        <w:rPr>
+          <w:b/>
+          <w:bCs/>
+          <w:lang w:val="en-IL"/>
+        </w:rPr>
+      </w:pPr>
+      <w:r>
+        <w:rPr>
+          <w:b/>
+          <w:bCs/>
+          <w:lang w:val="en-IL"/>
+        </w:rPr>
+        <w:t>Purpose:</w:t>
+      </w:r>
+    </w:p>
+    <w:p>
+      <w:pPr>
+        <w:rPr>
+          <w:b/>
+          <w:bCs/>
+          <w:lang w:val="en-IL"/>
+        </w:rPr>
+      </w:pPr>
+      <w:r>
+        <w:rPr>
+          <w:b/>
+          <w:bCs/>
+          <w:lang w:val="en-IL"/>
+        </w:rPr>
+        <w:t>Create exploration feeling.</w:t>
+      </w:r>
+    </w:p>
+    <w:p>
+      <w:pPr>
+        <w:rPr>
+          <w:b/>
+          <w:bCs/>
+          <w:lang w:val="en-IL"/>
+        </w:rPr>
+      </w:pPr>
+      <w:r>
+        <w:rPr>
+          <w:b/>
+          <w:bCs/>
+          <w:lang w:val="en-IL"/>
+        </w:rPr>
+        <w:pict w14:anchorId="33C58881">
+          <v:rect id="_x0000_i1208" style="width:0;height:1.5pt" o:hralign="center" o:hrstd="t" o:hr="t" fillcolor="#a0a0a0" stroked="f"/>
+        </w:pict>
+      </w:r>
+    </w:p>
+    <w:p>
+      <w:pPr>
+        <w:rPr>
+          <w:b/>
+          <w:bCs/>
+          <w:lang w:val="en-IL"/>
+        </w:rPr>
+      </w:pPr>
+      <w:r>
+        <w:rPr>
+          <w:b/>
+          <w:bCs/>
+          <w:lang w:val="en-IL"/>
+        </w:rPr>
+        <w:t>SECTION 2 — Executive Summary</w:t>
+      </w:r>
+    </w:p>
+    <w:p>
+      <w:pPr>
+        <w:rPr>
+          <w:b/>
+          <w:bCs/>
+          <w:lang w:val="en-IL"/>
+        </w:rPr>
+      </w:pPr>
+      <w:r>
+        <w:rPr>
+          <w:b/>
+          <w:bCs/>
+          <w:lang w:val="en-IL"/>
+        </w:rPr>
+        <w:t>Reserved future AI location.</w:t>
+      </w:r>
+    </w:p>
+    <w:p>
+      <w:pPr>
+        <w:rPr>
+          <w:b/>
+          <w:bCs/>
+          <w:lang w:val="en-IL"/>
+        </w:rPr>
+      </w:pPr>
+      <w:r>
+        <w:rPr>
+          <w:b/>
+          <w:bCs/>
+          <w:lang w:val="en-IL"/>
+        </w:rPr>
+        <w:t>MVP:</w:t>
+      </w:r>
+    </w:p>
+    <w:p>
+      <w:pPr>
+        <w:rPr>
+          <w:b/>
+          <w:bCs/>
+          <w:lang w:val="en-IL"/>
+        </w:rPr>
+      </w:pPr>
+      <w:r>
+        <w:rPr>
+          <w:b/>
+          <w:bCs/>
+          <w:lang w:val="en-IL"/>
+        </w:rPr>
+        <w:t>Rule-based narrative.</w:t>
+      </w:r>
+    </w:p>
+    <w:p>
+      <w:pPr>
+        <w:rPr>
+          <w:b/>
+          <w:bCs/>
+          <w:lang w:val="en-IL"/>
+        </w:rPr>
+      </w:pPr>
+      <w:r>
+        <w:rPr>
+          <w:b/>
+          <w:bCs/>
+          <w:lang w:val="en-IL"/>
+        </w:rPr>
+        <w:t>Future:</w:t>
+      </w:r>
+    </w:p>
+    <w:p>
+      <w:pPr>
+        <w:rPr>
+          <w:b/>
+          <w:bCs/>
+          <w:lang w:val="en-IL"/>
+        </w:rPr>
+      </w:pPr>
+      <w:r>
+        <w:rPr>
+          <w:b/>
+          <w:bCs/>
+          <w:lang w:val="en-IL"/>
+        </w:rPr>
+        <w:t>LLM-generated explanation.</w:t>
+      </w:r>
+    </w:p>
+    <w:p>
+      <w:pPr>
+        <w:rPr>
+          <w:b/>
+          <w:bCs/>
+          <w:lang w:val="en-IL"/>
+        </w:rPr>
+      </w:pPr>
+      <w:r>
+        <w:rPr>
+          <w:b/>
+          <w:bCs/>
+          <w:lang w:val="en-IL"/>
+        </w:rPr>
+        <w:t>Example:</w:t>
+      </w:r>
+    </w:p>
+    <w:p>
+      <w:pPr>
+        <w:rPr>
+          <w:b/>
+          <w:bCs/>
+          <w:lang w:val="en-IL"/>
+        </w:rPr>
+      </w:pPr>
+      <w:r>
+        <w:rPr>
+          <w:b/>
+          <w:bCs/>
+          <w:lang w:val="en-IL"/>
+        </w:rPr>
+        <w:lastRenderedPageBreak/>
+        <w:t>Germany combines strong innovation performance,</w:t>
+      </w:r>
+    </w:p>
+    <w:p>
+      <w:pPr>
+        <w:rPr>
+          <w:b/>
+          <w:bCs/>
+          <w:lang w:val="en-IL"/>
+        </w:rPr>
+      </w:pPr>
+      <w:r>
+        <w:rPr>
+          <w:b/>
+          <w:bCs/>
+          <w:lang w:val="en-IL"/>
+        </w:rPr>
+        <w:t>advanced industrial capabilities,</w:t>
+      </w:r>
+    </w:p>
+    <w:p>
+      <w:pPr>
+        <w:rPr>
+          <w:b/>
+          <w:bCs/>
+          <w:lang w:val="en-IL"/>
+        </w:rPr>
+      </w:pPr>
+      <w:r>
+        <w:rPr>
+          <w:b/>
+          <w:bCs/>
+          <w:lang w:val="en-IL"/>
+        </w:rPr>
+        <w:t>and high human capital.</w:t>
+      </w:r>
+    </w:p>
+    <w:p>
+      <w:pPr>
+        <w:rPr>
+          <w:b/>
+          <w:bCs/>
+          <w:lang w:val="en-IL"/>
+        </w:rPr>
+      </w:pPr>
+    </w:p>
+    <w:p>
+      <w:pPr>
+        <w:rPr>
+          <w:b/>
+          <w:bCs/>
+          <w:lang w:val="en-IL"/>
+        </w:rPr>
+      </w:pPr>
+      <w:r>
+        <w:rPr>
+          <w:b/>
+          <w:bCs/>
+          <w:lang w:val="en-IL"/>
+        </w:rPr>
+        <w:t>Its main challenges include fiscal flexibility,</w:t>
+      </w:r>
+    </w:p>
+    <w:p>
+      <w:pPr>
+        <w:rPr>
+          <w:b/>
+          <w:bCs/>
+          <w:lang w:val="en-IL"/>
+        </w:rPr>
+      </w:pPr>
+      <w:r>
+        <w:rPr>
+          <w:b/>
+          <w:bCs/>
+          <w:lang w:val="en-IL"/>
+        </w:rPr>
+        <w:t>demographic pressure,</w:t>
+      </w:r>
+    </w:p>
+    <w:p>
+      <w:pPr>
+        <w:rPr>
+          <w:b/>
+          <w:bCs/>
+          <w:lang w:val="en-IL"/>
+        </w:rPr>
+      </w:pPr>
+      <w:r>
+        <w:rPr>
+          <w:b/>
+          <w:bCs/>
+          <w:lang w:val="en-IL"/>
+        </w:rPr>
+        <w:t>and transition complexity.</w:t>
+      </w:r>
+    </w:p>
+    <w:p>
+      <w:pPr>
+        <w:rPr>
+          <w:b/>
+          <w:bCs/>
+          <w:lang w:val="en-IL"/>
+        </w:rPr>
+      </w:pPr>
+      <w:r>
+        <w:rPr>
+          <w:b/>
+          <w:bCs/>
+          <w:lang w:val="en-IL"/>
+        </w:rPr>
+        <w:t>This section should become one of the most important parts of the page.</w:t>
+      </w:r>
+    </w:p>
+    <w:p>
+      <w:pPr>
+        <w:rPr>
+          <w:b/>
+          <w:bCs/>
+          <w:lang w:val="en-IL"/>
+        </w:rPr>
+      </w:pPr>
+      <w:r>
+        <w:rPr>
+          <w:b/>
+          <w:bCs/>
+          <w:lang w:val="en-IL"/>
+        </w:rPr>
+        <w:pict w14:anchorId="3C129A00">
+          <v:rect id="_x0000_i1209" style="width:0;height:1.5pt" o:hralign="center" o:hrstd="t" o:hr="t" fillcolor="#a0a0a0" stroked="f"/>
+        </w:pict>
+      </w:r>
+    </w:p>
+    <w:p>
+      <w:pPr>
+        <w:rPr>
+          <w:b/>
+          <w:bCs/>
+          <w:lang w:val="en-IL"/>
+        </w:rPr>
+      </w:pPr>
+      <w:r>
+        <w:rPr>
+          <w:b/>
+          <w:bCs/>
+          <w:lang w:val="en-IL"/>
+        </w:rPr>
+        <w:t>SECTION 3 — Evolution Through Time</w:t>
+      </w:r>
+    </w:p>
+    <w:p>
+      <w:pPr>
+        <w:rPr>
+          <w:b/>
+          <w:bCs/>
+          <w:lang w:val="en-IL"/>
+        </w:rPr>
+      </w:pPr>
+      <w:r>
+        <w:rPr>
+          <w:b/>
+          <w:bCs/>
+          <w:lang w:val="en-IL"/>
+        </w:rPr>
+        <w:t>Primary Analytical Visual</w:t>
+      </w:r>
+    </w:p>
+    <w:p>
+      <w:pPr>
+        <w:rPr>
+          <w:b/>
+          <w:bCs/>
+          <w:lang w:val="en-IL"/>
+        </w:rPr>
+      </w:pPr>
+      <w:r>
+        <w:rPr>
+          <w:b/>
+          <w:bCs/>
+          <w:lang w:val="en-IL"/>
+        </w:rPr>
+        <w:t>This should be the largest analytical visual on the page.</w:t>
+      </w:r>
+    </w:p>
+    <w:p>
+      <w:pPr>
+        <w:rPr>
+          <w:b/>
+          <w:bCs/>
+          <w:lang w:val="en-IL"/>
+        </w:rPr>
+      </w:pPr>
+      <w:r>
+        <w:rPr>
+          <w:b/>
+          <w:bCs/>
+          <w:lang w:val="en-IL"/>
+        </w:rPr>
+        <w:t>Reason:</w:t>
+      </w:r>
+    </w:p>
+    <w:p>
+      <w:pPr>
+        <w:rPr>
+          <w:b/>
+          <w:bCs/>
+          <w:lang w:val="en-IL"/>
+        </w:rPr>
+      </w:pPr>
+      <w:r>
+        <w:rPr>
+          <w:b/>
+          <w:bCs/>
+          <w:lang w:val="en-IL"/>
+        </w:rPr>
+        <w:t>The project is fundamentally about:</w:t>
+      </w:r>
+    </w:p>
+    <w:p>
+      <w:pPr>
+        <w:rPr>
+          <w:b/>
+          <w:bCs/>
+          <w:lang w:val="en-IL"/>
+        </w:rPr>
+      </w:pPr>
+      <w:r>
+        <w:rPr>
+          <w:b/>
+          <w:bCs/>
+          <w:lang w:val="en-IL"/>
+        </w:rPr>
+        <w:t>Structural evolution</w:t>
+      </w:r>
+    </w:p>
+    <w:p>
+      <w:pPr>
+        <w:rPr>
+          <w:b/>
+          <w:bCs/>
+          <w:lang w:val="en-IL"/>
+        </w:rPr>
+      </w:pPr>
+      <w:r>
+        <w:rPr>
+          <w:b/>
+          <w:bCs/>
+          <w:lang w:val="en-IL"/>
+        </w:rPr>
+        <w:t>not static rankings.</w:t>
+      </w:r>
+    </w:p>
+    <w:p>
+      <w:pPr>
+        <w:rPr>
+          <w:b/>
+          <w:bCs/>
+          <w:lang w:val="en-IL"/>
+        </w:rPr>
+      </w:pPr>
+      <w:r>
+        <w:rPr>
+          <w:b/>
+          <w:bCs/>
+          <w:lang w:val="en-IL"/>
+        </w:rPr>
+        <w:pict w14:anchorId="30AAC360">
+          <v:rect id="_x0000_i1210" style="width:0;height:1.5pt" o:hralign="center" o:hrstd="t" o:hr="t" fillcolor="#a0a0a0" stroked="f"/>
+        </w:pict>
+      </w:r>
+    </w:p>
+    <w:p>
+      <w:pPr>
+        <w:rPr>
+          <w:b/>
+          <w:bCs/>
+          <w:lang w:val="en-IL"/>
+        </w:rPr>
+      </w:pPr>
+      <w:r>
+        <w:rPr>
+          <w:b/>
+          <w:bCs/>
+          <w:lang w:val="en-IL"/>
+        </w:rPr>
+        <w:t>Content</w:t>
+      </w:r>
+    </w:p>
+    <w:p>
+      <w:pPr>
+        <w:rPr>
+          <w:b/>
+          <w:bCs/>
+          <w:lang w:val="en-IL"/>
+        </w:rPr>
+      </w:pPr>
+      <w:r>
+        <w:rPr>
+          <w:b/>
+          <w:bCs/>
+          <w:lang w:val="en-IL"/>
+        </w:rPr>
+        <w:t>Selected dimensions:</w:t>
+      </w:r>
+    </w:p>
+    <w:p>
+      <w:pPr>
+        <w:rPr>
+          <w:b/>
+          <w:bCs/>
+          <w:lang w:val="en-IL"/>
+        </w:rPr>
+      </w:pPr>
+      <w:r>
+        <w:rPr>
+          <w:b/>
+          <w:bCs/>
+          <w:lang w:val="en-IL"/>
+        </w:rPr>
+        <w:t>Innovation</w:t>
+      </w:r>
+    </w:p>
+    <w:p>
+      <w:pPr>
+        <w:rPr>
+          <w:b/>
+          <w:bCs/>
+          <w:lang w:val="en-IL"/>
+        </w:rPr>
+      </w:pPr>
+    </w:p>
+    <w:p>
+      <w:pPr>
+        <w:rPr>
+          <w:b/>
+          <w:bCs/>
+          <w:lang w:val="en-IL"/>
+        </w:rPr>
+      </w:pPr>
+      <w:r>
+        <w:rPr>
+          <w:b/>
+          <w:bCs/>
+          <w:lang w:val="en-IL"/>
+        </w:rPr>
+        <w:t>Economic Potential</w:t>
+      </w:r>
+    </w:p>
+    <w:p>
+      <w:pPr>
+        <w:rPr>
+          <w:b/>
+          <w:bCs/>
+          <w:lang w:val="en-IL"/>
+        </w:rPr>
+      </w:pPr>
+    </w:p>
+    <w:p>
+      <w:pPr>
+        <w:rPr>
+          <w:b/>
+          <w:bCs/>
+          <w:lang w:val="en-IL"/>
+        </w:rPr>
+      </w:pPr>
+      <w:r>
+        <w:rPr>
+          <w:b/>
+          <w:bCs/>
+          <w:lang w:val="en-IL"/>
+        </w:rPr>
+        <w:t>Social Cohesion</w:t>
+      </w:r>
+    </w:p>
+    <w:p>
+      <w:pPr>
+        <w:rPr>
+          <w:b/>
+          <w:bCs/>
+          <w:lang w:val="en-IL"/>
+        </w:rPr>
+      </w:pPr>
+    </w:p>
+    <w:p>
+      <w:pPr>
+        <w:rPr>
+          <w:b/>
+          <w:bCs/>
+          <w:lang w:val="en-IL"/>
+        </w:rPr>
+      </w:pPr>
+      <w:r>
+        <w:rPr>
+          <w:b/>
+          <w:bCs/>
+          <w:lang w:val="en-IL"/>
+        </w:rPr>
+        <w:t>Sustainability</w:t>
+      </w:r>
+    </w:p>
+    <w:p>
+      <w:pPr>
+        <w:rPr>
+          <w:b/>
+          <w:bCs/>
+          <w:lang w:val="en-IL"/>
+        </w:rPr>
+      </w:pPr>
+    </w:p>
+    <w:p>
+      <w:pPr>
+        <w:rPr>
+          <w:b/>
+          <w:bCs/>
+          <w:lang w:val="en-IL"/>
+        </w:rPr>
+      </w:pPr>
+      <w:r>
+        <w:rPr>
+          <w:b/>
+          <w:bCs/>
+          <w:lang w:val="en-IL"/>
+        </w:rPr>
+        <w:t>Resilience</w:t>
+      </w:r>
+    </w:p>
+    <w:p>
+      <w:pPr>
+        <w:rPr>
+          <w:b/>
+          <w:bCs/>
+          <w:lang w:val="en-IL"/>
+        </w:rPr>
+      </w:pPr>
+      <w:r>
+        <w:rPr>
+          <w:b/>
+          <w:bCs/>
+          <w:lang w:val="en-IL"/>
+        </w:rPr>
+        <w:lastRenderedPageBreak/>
+        <w:t>shown across:</w:t>
+      </w:r>
+    </w:p>
+    <w:p>
+      <w:pPr>
+        <w:rPr>
+          <w:b/>
+          <w:bCs/>
+          <w:lang w:val="en-IL"/>
+        </w:rPr>
+      </w:pPr>
+      <w:r>
+        <w:rPr>
+          <w:b/>
+          <w:bCs/>
+          <w:lang w:val="en-IL"/>
+        </w:rPr>
+        <w:t>2014 → 2025</w:t>
+      </w:r>
+    </w:p>
+    <w:p>
+      <w:pPr>
+        <w:rPr>
+          <w:b/>
+          <w:bCs/>
+          <w:lang w:val="en-IL"/>
+        </w:rPr>
+      </w:pPr>
+      <w:r>
+        <w:rPr>
+          <w:b/>
+          <w:bCs/>
+          <w:lang w:val="en-IL"/>
+        </w:rPr>
+        <w:pict w14:anchorId="2215F765">
+          <v:rect id="_x0000_i1211" style="width:0;height:1.5pt" o:hralign="center" o:hrstd="t" o:hr="t" fillcolor="#a0a0a0" stroked="f"/>
+        </w:pict>
+      </w:r>
+    </w:p>
+    <w:p>
+      <w:pPr>
+        <w:rPr>
+          <w:b/>
+          <w:bCs/>
+          <w:lang w:val="en-IL"/>
+        </w:rPr>
+      </w:pPr>
+      <w:r>
+        <w:rPr>
+          <w:b/>
+          <w:bCs/>
+          <w:lang w:val="en-IL"/>
+        </w:rPr>
+        <w:t>Comparison Options</w:t>
+      </w:r>
+    </w:p>
+    <w:p>
+      <w:pPr>
+        <w:rPr>
+          <w:b/>
+          <w:bCs/>
+          <w:lang w:val="en-IL"/>
+        </w:rPr>
+      </w:pPr>
+      <w:r>
+        <w:rPr>
+          <w:b/>
+          <w:bCs/>
+          <w:lang w:val="en-IL"/>
+        </w:rPr>
+        <w:t>User can compare:</w:t>
+      </w:r>
+    </w:p>
+    <w:p>
+      <w:pPr>
+        <w:rPr>
+          <w:b/>
+          <w:bCs/>
+          <w:lang w:val="en-IL"/>
+        </w:rPr>
+      </w:pPr>
+      <w:r>
+        <w:rPr>
+          <w:b/>
+          <w:bCs/>
+          <w:lang w:val="en-IL"/>
+        </w:rPr>
+        <w:t>Country</w:t>
+      </w:r>
+    </w:p>
+    <w:p>
+      <w:pPr>
+        <w:rPr>
+          <w:b/>
+          <w:bCs/>
+          <w:lang w:val="en-IL"/>
+        </w:rPr>
+      </w:pPr>
+    </w:p>
+    <w:p>
+      <w:pPr>
+        <w:rPr>
+          <w:b/>
+          <w:bCs/>
+          <w:lang w:val="en-IL"/>
+        </w:rPr>
+      </w:pPr>
+      <w:r>
+        <w:rPr>
+          <w:b/>
+          <w:bCs/>
+          <w:lang w:val="en-IL"/>
+        </w:rPr>
+        <w:t>vs EU</w:t>
+      </w:r>
+    </w:p>
+    <w:p>
+      <w:pPr>
+        <w:rPr>
+          <w:b/>
+          <w:bCs/>
+          <w:lang w:val="en-IL"/>
+        </w:rPr>
+      </w:pPr>
+    </w:p>
+    <w:p>
+      <w:pPr>
+        <w:rPr>
+          <w:b/>
+          <w:bCs/>
+          <w:lang w:val="en-IL"/>
+        </w:rPr>
+      </w:pPr>
+      <w:r>
+        <w:rPr>
+          <w:b/>
+          <w:bCs/>
+          <w:lang w:val="en-IL"/>
+        </w:rPr>
+        <w:t>vs Family</w:t>
+      </w:r>
+    </w:p>
+    <w:p>
+      <w:pPr>
+        <w:rPr>
+          <w:b/>
+          <w:bCs/>
+          <w:lang w:val="en-IL"/>
+        </w:rPr>
+      </w:pPr>
+    </w:p>
+    <w:p>
+      <w:pPr>
+        <w:rPr>
+          <w:b/>
+          <w:bCs/>
+          <w:lang w:val="en-IL"/>
+        </w:rPr>
+      </w:pPr>
+      <w:r>
+        <w:rPr>
+          <w:b/>
+          <w:bCs/>
+          <w:lang w:val="en-IL"/>
+        </w:rPr>
+        <w:t>vs Another Country</w:t>
+      </w:r>
+    </w:p>
+    <w:p>
+      <w:pPr>
+        <w:rPr>
+          <w:b/>
+          <w:bCs/>
+          <w:lang w:val="en-IL"/>
+        </w:rPr>
+      </w:pPr>
+      <w:r>
+        <w:rPr>
+          <w:b/>
+          <w:bCs/>
+          <w:lang w:val="en-IL"/>
+        </w:rPr>
+        <w:pict w14:anchorId="3FC0960A">
+          <v:rect id="_x0000_i1212" style="width:0;height:1.5pt" o:hralign="center" o:hrstd="t" o:hr="t" fillcolor="#a0a0a0" stroked="f"/>
+        </w:pict>
+      </w:r>
+    </w:p>
+    <w:p>
+      <w:pPr>
+        <w:rPr>
+          <w:b/>
+          <w:bCs/>
+          <w:lang w:val="en-IL"/>
+        </w:rPr>
+      </w:pPr>
+      <w:r>
+        <w:rPr>
+          <w:b/>
+          <w:bCs/>
+          <w:lang w:val="en-IL"/>
+        </w:rPr>
+        <w:t>Educational Questions</w:t>
+      </w:r>
+    </w:p>
+    <w:p>
+      <w:pPr>
+        <w:rPr>
+          <w:b/>
+          <w:bCs/>
+          <w:lang w:val="en-IL"/>
+        </w:rPr>
+      </w:pPr>
+      <w:r>
+        <w:rPr>
+          <w:b/>
+          <w:bCs/>
+          <w:lang w:val="en-IL"/>
+        </w:rPr>
+        <w:t>Displayed nearby:</w:t>
+      </w:r>
+    </w:p>
+    <w:p>
+      <w:pPr>
+        <w:rPr>
+          <w:b/>
+          <w:bCs/>
+          <w:lang w:val="en-IL"/>
+        </w:rPr>
+      </w:pPr>
+      <w:r>
+        <w:rPr>
+          <w:b/>
+          <w:bCs/>
+          <w:lang w:val="en-IL"/>
+        </w:rPr>
+        <w:t>How has Germany evolved since 2014?</w:t>
+      </w:r>
+    </w:p>
+    <w:p>
+      <w:pPr>
+        <w:rPr>
+          <w:b/>
+          <w:bCs/>
+          <w:lang w:val="en-IL"/>
+        </w:rPr>
+      </w:pPr>
+    </w:p>
+    <w:p>
+      <w:pPr>
+        <w:rPr>
+          <w:b/>
+          <w:bCs/>
+          <w:lang w:val="en-IL"/>
+        </w:rPr>
+      </w:pPr>
+      <w:r>
+        <w:rPr>
+          <w:b/>
+          <w:bCs/>
+          <w:lang w:val="en-IL"/>
+        </w:rPr>
+        <w:t>Did Germany become more innovative?</w:t>
+      </w:r>
+    </w:p>
+    <w:p>
+      <w:pPr>
+        <w:rPr>
+          <w:b/>
+          <w:bCs/>
+          <w:lang w:val="en-IL"/>
+        </w:rPr>
+      </w:pPr>
+    </w:p>
+    <w:p>
+      <w:pPr>
+        <w:rPr>
+          <w:b/>
+          <w:bCs/>
+          <w:lang w:val="en-IL"/>
+        </w:rPr>
+      </w:pPr>
+      <w:r>
+        <w:rPr>
+          <w:b/>
+          <w:bCs/>
+          <w:lang w:val="en-IL"/>
+        </w:rPr>
+        <w:t>How did COVID influence the trajectory?</w:t>
+      </w:r>
+    </w:p>
+    <w:p>
+      <w:pPr>
+        <w:rPr>
+          <w:b/>
+          <w:bCs/>
+          <w:lang w:val="en-IL"/>
+        </w:rPr>
+      </w:pPr>
+      <w:r>
+        <w:rPr>
+          <w:b/>
+          <w:bCs/>
+          <w:lang w:val="en-IL"/>
+        </w:rPr>
+        <w:pict w14:anchorId="5A48C7E3">
+          <v:rect id="_x0000_i1213" style="width:0;height:1.5pt" o:hralign="center" o:hrstd="t" o:hr="t" fillcolor="#a0a0a0" stroked="f"/>
+        </w:pict>
+      </w:r>
+    </w:p>
+    <w:p>
+      <w:pPr>
+        <w:rPr>
+          <w:b/>
+          <w:bCs/>
+          <w:lang w:val="en-IL"/>
+        </w:rPr>
+      </w:pPr>
+      <w:r>
+        <w:rPr>
+          <w:b/>
+          <w:bCs/>
+          <w:lang w:val="en-IL"/>
+        </w:rPr>
+        <w:t>SECTION 4 — Family Context</w:t>
+      </w:r>
+    </w:p>
+    <w:p>
+      <w:pPr>
+        <w:rPr>
+          <w:b/>
+          <w:bCs/>
+          <w:lang w:val="en-IL"/>
+        </w:rPr>
+      </w:pPr>
+      <w:r>
+        <w:rPr>
+          <w:b/>
+          <w:bCs/>
+          <w:lang w:val="en-IL"/>
+        </w:rPr>
+        <w:t>Purpose:</w:t>
+      </w:r>
+    </w:p>
+    <w:p>
+      <w:pPr>
+        <w:rPr>
+          <w:b/>
+          <w:bCs/>
+          <w:lang w:val="en-IL"/>
+        </w:rPr>
+      </w:pPr>
+      <w:r>
+        <w:rPr>
+          <w:b/>
+          <w:bCs/>
+          <w:lang w:val="en-IL"/>
+        </w:rPr>
+        <w:t>Help users understand that countries belong to broader structural groups.</w:t>
+      </w:r>
+    </w:p>
+    <w:p>
+      <w:pPr>
+        <w:rPr>
+          <w:b/>
+          <w:bCs/>
+          <w:lang w:val="en-IL"/>
+        </w:rPr>
+      </w:pPr>
+      <w:r>
+        <w:rPr>
+          <w:b/>
+          <w:bCs/>
+          <w:lang w:val="en-IL"/>
+        </w:rPr>
+        <w:pict w14:anchorId="35292988">
+          <v:rect id="_x0000_i1214" style="width:0;height:1.5pt" o:hralign="center" o:hrstd="t" o:hr="t" fillcolor="#a0a0a0" stroked="f"/>
+        </w:pict>
+      </w:r>
+    </w:p>
+    <w:p>
+      <w:pPr>
+        <w:rPr>
+          <w:b/>
+          <w:bCs/>
+          <w:lang w:val="en-IL"/>
+        </w:rPr>
+      </w:pPr>
+      <w:r>
+        <w:rPr>
+          <w:b/>
+          <w:bCs/>
+          <w:lang w:val="en-IL"/>
+        </w:rPr>
+        <w:t>Family Card</w:t>
+      </w:r>
+    </w:p>
+    <w:p>
+      <w:pPr>
+        <w:rPr>
+          <w:b/>
+          <w:bCs/>
+          <w:lang w:val="en-IL"/>
+        </w:rPr>
+      </w:pPr>
+      <w:r>
+        <w:rPr>
+          <w:b/>
+          <w:bCs/>
+          <w:lang w:val="en-IL"/>
+        </w:rPr>
+        <w:t>Example:</w:t>
+      </w:r>
+    </w:p>
+    <w:p>
+      <w:pPr>
+        <w:rPr>
+          <w:b/>
+          <w:bCs/>
+          <w:lang w:val="en-IL"/>
+        </w:rPr>
+      </w:pPr>
+      <w:r>
+        <w:rPr>
+          <w:b/>
+          <w:bCs/>
+          <w:lang w:val="en-IL"/>
+        </w:rPr>
+        <w:t>Innovation Core Family</w:t>
+      </w:r>
+    </w:p>
+    <w:p>
+      <w:pPr>
+        <w:rPr>
+          <w:b/>
+          <w:bCs/>
+          <w:lang w:val="en-IL"/>
+        </w:rPr>
+      </w:pPr>
+      <w:r>
+        <w:rPr>
+          <w:b/>
+          <w:bCs/>
+          <w:lang w:val="en-IL"/>
+        </w:rPr>
+        <w:lastRenderedPageBreak/>
+        <w:t>Members:</w:t>
+      </w:r>
+    </w:p>
+    <w:p>
+      <w:pPr>
+        <w:rPr>
+          <w:b/>
+          <w:bCs/>
+          <w:lang w:val="en-IL"/>
+        </w:rPr>
+      </w:pPr>
+      <w:r>
+        <w:rPr>
+          <w:b/>
+          <w:bCs/>
+          <w:lang w:val="en-IL"/>
+        </w:rPr>
+        <w:t>Germany</w:t>
+      </w:r>
+    </w:p>
+    <w:p>
+      <w:pPr>
+        <w:rPr>
+          <w:b/>
+          <w:bCs/>
+          <w:lang w:val="en-IL"/>
+        </w:rPr>
+      </w:pPr>
+      <w:r>
+        <w:rPr>
+          <w:b/>
+          <w:bCs/>
+          <w:lang w:val="en-IL"/>
+        </w:rPr>
+        <w:t>Sweden</w:t>
+      </w:r>
+    </w:p>
+    <w:p>
+      <w:pPr>
+        <w:rPr>
+          <w:b/>
+          <w:bCs/>
+          <w:lang w:val="en-IL"/>
+        </w:rPr>
+      </w:pPr>
+      <w:r>
+        <w:rPr>
+          <w:b/>
+          <w:bCs/>
+          <w:lang w:val="en-IL"/>
+        </w:rPr>
+        <w:t>Finland</w:t>
+      </w:r>
+    </w:p>
+    <w:p>
+      <w:pPr>
+        <w:rPr>
+          <w:b/>
+          <w:bCs/>
+          <w:lang w:val="en-IL"/>
+        </w:rPr>
+      </w:pPr>
+      <w:r>
+        <w:rPr>
+          <w:b/>
+          <w:bCs/>
+          <w:lang w:val="en-IL"/>
+        </w:rPr>
+        <w:t>Netherlands</w:t>
+      </w:r>
+    </w:p>
+    <w:p>
+      <w:pPr>
+        <w:rPr>
+          <w:b/>
+          <w:bCs/>
+          <w:lang w:val="en-IL"/>
+        </w:rPr>
+      </w:pPr>
+      <w:r>
+        <w:rPr>
+          <w:b/>
+          <w:bCs/>
+          <w:lang w:val="en-IL"/>
+        </w:rPr>
+        <w:pict w14:anchorId="072B06A0">
+          <v:rect id="_x0000_i1215" style="width:0;height:1.5pt" o:hralign="center" o:hrstd="t" o:hr="t" fillcolor="#a0a0a0" stroked="f"/>
+        </w:pict>
+      </w:r>
+    </w:p>
+    <w:p>
+      <w:pPr>
+        <w:rPr>
+          <w:b/>
+          <w:bCs/>
+          <w:lang w:val="en-IL"/>
+        </w:rPr>
+      </w:pPr>
+      <w:r>
+        <w:rPr>
+          <w:b/>
+          <w:bCs/>
+          <w:lang w:val="en-IL"/>
+        </w:rPr>
+        <w:t>Shared Characteristics</w:t>
+      </w:r>
+    </w:p>
+    <w:p>
+      <w:pPr>
+        <w:rPr>
+          <w:b/>
+          <w:bCs/>
+          <w:lang w:val="en-IL"/>
+        </w:rPr>
+      </w:pPr>
+      <w:r>
+        <w:rPr>
+          <w:b/>
+          <w:bCs/>
+          <w:lang w:val="en-IL"/>
+        </w:rPr>
+        <w:t>Examples:</w:t>
+      </w:r>
+    </w:p>
+    <w:p>
+      <w:pPr>
+        <w:rPr>
+          <w:b/>
+          <w:bCs/>
+          <w:lang w:val="en-IL"/>
+        </w:rPr>
+      </w:pPr>
+      <w:r>
+        <w:rPr>
+          <w:b/>
+          <w:bCs/>
+          <w:lang w:val="en-IL"/>
+        </w:rPr>
+        <w:t>High innovation</w:t>
+      </w:r>
+    </w:p>
+    <w:p>
+      <w:pPr>
+        <w:rPr>
+          <w:b/>
+          <w:bCs/>
+          <w:lang w:val="en-IL"/>
+        </w:rPr>
+      </w:pPr>
+    </w:p>
+    <w:p>
+      <w:pPr>
+        <w:rPr>
+          <w:b/>
+          <w:bCs/>
+          <w:lang w:val="en-IL"/>
+        </w:rPr>
+      </w:pPr>
+      <w:r>
+        <w:rPr>
+          <w:b/>
+          <w:bCs/>
+          <w:lang w:val="en-IL"/>
+        </w:rPr>
+        <w:t>High human capital</w:t>
+      </w:r>
+    </w:p>
+    <w:p>
+      <w:pPr>
+        <w:rPr>
+          <w:b/>
+          <w:bCs/>
+          <w:lang w:val="en-IL"/>
+        </w:rPr>
+      </w:pPr>
+    </w:p>
+    <w:p>
+      <w:pPr>
+        <w:rPr>
+          <w:b/>
+          <w:bCs/>
+          <w:lang w:val="en-IL"/>
+        </w:rPr>
+      </w:pPr>
+      <w:r>
+        <w:rPr>
+          <w:b/>
+          <w:bCs/>
+          <w:lang w:val="en-IL"/>
+        </w:rPr>
+        <w:t>Strong institutions</w:t>
+      </w:r>
+    </w:p>
+    <w:p>
+      <w:pPr>
+        <w:rPr>
+          <w:b/>
+          <w:bCs/>
+          <w:lang w:val="en-IL"/>
+        </w:rPr>
+      </w:pPr>
+      <w:r>
+        <w:rPr>
+          <w:b/>
+          <w:bCs/>
+          <w:lang w:val="en-IL"/>
+        </w:rPr>
+        <w:pict w14:anchorId="18A9CECA">
+          <v:rect id="_x0000_i1216" style="width:0;height:1.5pt" o:hralign="center" o:hrstd="t" o:hr="t" fillcolor="#a0a0a0" stroked="f"/>
+        </w:pict>
+      </w:r>
+    </w:p>
+    <w:p>
+      <w:pPr>
+        <w:rPr>
+          <w:b/>
+          <w:bCs/>
+          <w:lang w:val="en-IL"/>
+        </w:rPr>
+      </w:pPr>
+      <w:r>
+        <w:rPr>
+          <w:b/>
+          <w:bCs/>
+          <w:lang w:val="en-IL"/>
+        </w:rPr>
+        <w:t>Common Challenges</w:t>
+      </w:r>
+    </w:p>
+    <w:p>
+      <w:pPr>
+        <w:rPr>
+          <w:b/>
+          <w:bCs/>
+          <w:lang w:val="en-IL"/>
+        </w:rPr>
+      </w:pPr>
+      <w:r>
+        <w:rPr>
+          <w:b/>
+          <w:bCs/>
+          <w:lang w:val="en-IL"/>
+        </w:rPr>
+        <w:t>Examples:</w:t>
+      </w:r>
+    </w:p>
+    <w:p>
+      <w:pPr>
+        <w:rPr>
+          <w:b/>
+          <w:bCs/>
+          <w:lang w:val="en-IL"/>
+        </w:rPr>
+      </w:pPr>
+      <w:r>
+        <w:rPr>
+          <w:b/>
+          <w:bCs/>
+          <w:lang w:val="en-IL"/>
+        </w:rPr>
+        <w:t>Fiscal pressure</w:t>
+      </w:r>
+    </w:p>
+    <w:p>
+      <w:pPr>
+        <w:rPr>
+          <w:b/>
+          <w:bCs/>
+          <w:lang w:val="en-IL"/>
+        </w:rPr>
+      </w:pPr>
+    </w:p>
+    <w:p>
+      <w:pPr>
+        <w:rPr>
+          <w:b/>
+          <w:bCs/>
+          <w:lang w:val="en-IL"/>
+        </w:rPr>
+      </w:pPr>
+      <w:r>
+        <w:rPr>
+          <w:b/>
+          <w:bCs/>
+          <w:lang w:val="en-IL"/>
+        </w:rPr>
+        <w:t>Aging populations</w:t>
+      </w:r>
+    </w:p>
+    <w:p>
+      <w:pPr>
+        <w:rPr>
+          <w:b/>
+          <w:bCs/>
+          <w:lang w:val="en-IL"/>
+        </w:rPr>
+      </w:pPr>
+    </w:p>
+    <w:p>
+      <w:pPr>
+        <w:rPr>
+          <w:b/>
+          <w:bCs/>
+          <w:lang w:val="en-IL"/>
+        </w:rPr>
+      </w:pPr>
+      <w:r>
+        <w:rPr>
+          <w:b/>
+          <w:bCs/>
+          <w:lang w:val="en-IL"/>
+        </w:rPr>
+        <w:t>Transition complexity</w:t>
+      </w:r>
+    </w:p>
+    <w:p>
+      <w:pPr>
+        <w:rPr>
+          <w:b/>
+          <w:bCs/>
+          <w:lang w:val="en-IL"/>
+        </w:rPr>
+      </w:pPr>
+      <w:r>
+        <w:rPr>
+          <w:b/>
+          <w:bCs/>
+          <w:lang w:val="en-IL"/>
+        </w:rPr>
+        <w:pict w14:anchorId="456EEABB">
+          <v:rect id="_x0000_i1217" style="width:0;height:1.5pt" o:hralign="center" o:hrstd="t" o:hr="t" fillcolor="#a0a0a0" stroked="f"/>
+        </w:pict>
+      </w:r>
+    </w:p>
+    <w:p>
+      <w:pPr>
+        <w:rPr>
+          <w:b/>
+          <w:bCs/>
+          <w:lang w:val="en-IL"/>
+        </w:rPr>
+      </w:pPr>
+      <w:r>
+        <w:rPr>
+          <w:b/>
+          <w:bCs/>
+          <w:lang w:val="en-IL"/>
+        </w:rPr>
+        <w:t>Family Positioning</w:t>
+      </w:r>
+    </w:p>
+    <w:p>
+      <w:pPr>
+        <w:rPr>
+          <w:b/>
+          <w:bCs/>
+          <w:lang w:val="en-IL"/>
+        </w:rPr>
+      </w:pPr>
+      <w:r>
+        <w:rPr>
+          <w:b/>
+          <w:bCs/>
+          <w:lang w:val="en-IL"/>
+        </w:rPr>
+        <w:t>Show where the selected country sits inside the family.</w:t>
+      </w:r>
+    </w:p>
+    <w:p>
+      <w:pPr>
+        <w:rPr>
+          <w:b/>
+          <w:bCs/>
+          <w:lang w:val="en-IL"/>
+        </w:rPr>
+      </w:pPr>
+      <w:r>
+        <w:rPr>
+          <w:b/>
+          <w:bCs/>
+          <w:lang w:val="en-IL"/>
+        </w:rPr>
+        <w:t>Possible visual:</w:t>
+      </w:r>
+    </w:p>
+    <w:p>
+      <w:pPr>
+        <w:rPr>
+          <w:b/>
+          <w:bCs/>
+          <w:lang w:val="en-IL"/>
+        </w:rPr>
+      </w:pPr>
+      <w:r>
+        <w:rPr>
+          <w:b/>
+          <w:bCs/>
+          <w:lang w:val="en-IL"/>
+        </w:rPr>
+        <w:t>Leader</w:t>
+      </w:r>
+    </w:p>
+    <w:p>
+      <w:pPr>
+        <w:rPr>
+          <w:b/>
+          <w:bCs/>
+          <w:lang w:val="en-IL"/>
+        </w:rPr>
+      </w:pPr>
+    </w:p>
+    <w:p>
+      <w:pPr>
+        <w:rPr>
+          <w:b/>
+          <w:bCs/>
+          <w:lang w:val="en-IL"/>
+        </w:rPr>
+      </w:pPr>
+      <w:r>
+        <w:rPr>
+          <w:b/>
+          <w:bCs/>
+          <w:lang w:val="en-IL"/>
+        </w:rPr>
+        <w:t>Representative</w:t>
+      </w:r>
+    </w:p>
+    <w:p>
+      <w:pPr>
+        <w:rPr>
+          <w:b/>
+          <w:bCs/>
+          <w:lang w:val="en-IL"/>
+        </w:rPr>
+      </w:pPr>
+    </w:p>
+    <w:p>
+      <w:pPr>
+        <w:rPr>
+          <w:b/>
+          <w:bCs/>
+          <w:lang w:val="en-IL"/>
+        </w:rPr>
+      </w:pPr>
+      <w:r>
+        <w:rPr>
+          <w:b/>
+          <w:bCs/>
+          <w:lang w:val="en-IL"/>
+        </w:rPr>
+        <w:t>Bridge</w:t>
+      </w:r>
+    </w:p>
+    <w:p>
+      <w:pPr>
+        <w:rPr>
+          <w:b/>
+          <w:bCs/>
+          <w:lang w:val="en-IL"/>
+        </w:rPr>
+      </w:pPr>
+    </w:p>
+    <w:p>
+      <w:pPr>
+        <w:rPr>
+          <w:b/>
+          <w:bCs/>
+          <w:lang w:val="en-IL"/>
+        </w:rPr>
+      </w:pPr>
+      <w:r>
+        <w:rPr>
+          <w:b/>
+          <w:bCs/>
+          <w:lang w:val="en-IL"/>
+        </w:rPr>
+        <w:t>Outlier</w:t>
+      </w:r>
+    </w:p>
+    <w:p>
+      <w:pPr>
+        <w:rPr>
+          <w:b/>
+          <w:bCs/>
+          <w:lang w:val="en-IL"/>
+        </w:rPr>
+      </w:pPr>
+      <w:r>
+        <w:rPr>
+          <w:b/>
+          <w:bCs/>
+          <w:lang w:val="en-IL"/>
+        </w:rPr>
+        <w:pict w14:anchorId="4B2FEF7C">
+          <v:rect id="_x0000_i1218" style="width:0;height:1.5pt" o:hralign="center" o:hrstd="t" o:hr="t" fillcolor="#a0a0a0" stroked="f"/>
+        </w:pict>
+      </w:r>
+    </w:p>
+    <w:p>
+      <w:pPr>
+        <w:rPr>
+          <w:b/>
+          <w:bCs/>
+          <w:lang w:val="en-IL"/>
+        </w:rPr>
+      </w:pPr>
+      <w:r>
+        <w:rPr>
+          <w:b/>
+          <w:bCs/>
+          <w:lang w:val="en-IL"/>
+        </w:rPr>
+        <w:t>SECTION 5 — Strengths &amp; Constraints</w:t>
+      </w:r>
+    </w:p>
+    <w:p>
+      <w:pPr>
+        <w:rPr>
+          <w:b/>
+          <w:bCs/>
+          <w:lang w:val="en-IL"/>
+        </w:rPr>
+      </w:pPr>
+      <w:r>
+        <w:rPr>
+          <w:b/>
+          <w:bCs/>
+          <w:lang w:val="en-IL"/>
+        </w:rPr>
+        <w:t>Simple visual cards.</w:t>
+      </w:r>
+    </w:p>
+    <w:p>
+      <w:pPr>
+        <w:rPr>
+          <w:b/>
+          <w:bCs/>
+          <w:lang w:val="en-IL"/>
+        </w:rPr>
+      </w:pPr>
+      <w:r>
+        <w:rPr>
+          <w:b/>
+          <w:bCs/>
+          <w:lang w:val="en-IL"/>
+        </w:rPr>
+        <w:pict w14:anchorId="090342F0">
+          <v:rect id="_x0000_i1219" style="width:0;height:1.5pt" o:hralign="center" o:hrstd="t" o:hr="t" fillcolor="#a0a0a0" stroked="f"/>
+        </w:pict>
+      </w:r>
+    </w:p>
+    <w:p>
+      <w:pPr>
+        <w:rPr>
+          <w:b/>
+          <w:bCs/>
+          <w:lang w:val="en-IL"/>
+        </w:rPr>
+      </w:pPr>
+      <w:r>
+        <w:rPr>
+          <w:b/>
+          <w:bCs/>
+          <w:lang w:val="en-IL"/>
+        </w:rPr>
+        <w:t>Strengths</w:t>
+      </w:r>
+    </w:p>
+    <w:p>
+      <w:pPr>
+        <w:rPr>
+          <w:b/>
+          <w:bCs/>
+          <w:lang w:val="en-IL"/>
+        </w:rPr>
+      </w:pPr>
+      <w:r>
+        <w:rPr>
+          <w:b/>
+          <w:bCs/>
+          <w:lang w:val="en-IL"/>
+        </w:rPr>
+        <w:t>Examples:</w:t>
+      </w:r>
+    </w:p>
+    <w:p>
+      <w:pPr>
+        <w:rPr>
+          <w:b/>
+          <w:bCs/>
+          <w:lang w:val="en-IL"/>
+        </w:rPr>
+      </w:pPr>
+      <w:r>
+        <w:rPr>
+          <w:b/>
+          <w:bCs/>
+          <w:lang w:val="en-IL"/>
+        </w:rPr>
+        <w:t>Innovation</w:t>
+      </w:r>
+    </w:p>
+    <w:p>
+      <w:pPr>
+        <w:rPr>
+          <w:b/>
+          <w:bCs/>
+          <w:lang w:val="en-IL"/>
+        </w:rPr>
+      </w:pPr>
+    </w:p>
+    <w:p>
+      <w:pPr>
+        <w:rPr>
+          <w:b/>
+          <w:bCs/>
+          <w:lang w:val="en-IL"/>
+        </w:rPr>
+      </w:pPr>
+      <w:r>
+        <w:rPr>
+          <w:b/>
+          <w:bCs/>
+          <w:lang w:val="en-IL"/>
+        </w:rPr>
+        <w:t>Industrial Capacity</w:t>
+      </w:r>
+    </w:p>
+    <w:p>
+      <w:pPr>
+        <w:rPr>
+          <w:b/>
+          <w:bCs/>
+          <w:lang w:val="en-IL"/>
+        </w:rPr>
+      </w:pPr>
+    </w:p>
+    <w:p>
+      <w:pPr>
+        <w:rPr>
+          <w:b/>
+          <w:bCs/>
+          <w:lang w:val="en-IL"/>
+        </w:rPr>
+      </w:pPr>
+      <w:r>
+        <w:rPr>
+          <w:b/>
+          <w:bCs/>
+          <w:lang w:val="en-IL"/>
+        </w:rPr>
+        <w:t>Export Strength</w:t>
+      </w:r>
+    </w:p>
+    <w:p>
+      <w:pPr>
+        <w:rPr>
+          <w:b/>
+          <w:bCs/>
+          <w:lang w:val="en-IL"/>
+        </w:rPr>
+      </w:pPr>
+      <w:r>
+        <w:rPr>
+          <w:b/>
+          <w:bCs/>
+          <w:lang w:val="en-IL"/>
+        </w:rPr>
+        <w:pict w14:anchorId="5D2BB153">
+          <v:rect id="_x0000_i1220" style="width:0;height:1.5pt" o:hralign="center" o:hrstd="t" o:hr="t" fillcolor="#a0a0a0" stroked="f"/>
+        </w:pict>
+      </w:r>
+    </w:p>
+    <w:p>
+      <w:pPr>
+        <w:rPr>
+          <w:b/>
+          <w:bCs/>
+          <w:lang w:val="en-IL"/>
+        </w:rPr>
+      </w:pPr>
+      <w:r>
+        <w:rPr>
+          <w:b/>
+          <w:bCs/>
+          <w:lang w:val="en-IL"/>
+        </w:rPr>
+        <w:t>Constraints</w:t>
+      </w:r>
+    </w:p>
+    <w:p>
+      <w:pPr>
+        <w:rPr>
+          <w:b/>
+          <w:bCs/>
+          <w:lang w:val="en-IL"/>
+        </w:rPr>
+      </w:pPr>
+      <w:r>
+        <w:rPr>
+          <w:b/>
+          <w:bCs/>
+          <w:lang w:val="en-IL"/>
+        </w:rPr>
+        <w:t>Examples:</w:t>
+      </w:r>
+    </w:p>
+    <w:p>
+      <w:pPr>
+        <w:rPr>
+          <w:b/>
+          <w:bCs/>
+          <w:lang w:val="en-IL"/>
+        </w:rPr>
+      </w:pPr>
+      <w:r>
+        <w:rPr>
+          <w:b/>
+          <w:bCs/>
+          <w:lang w:val="en-IL"/>
+        </w:rPr>
+        <w:t>Fiscal Pressure</w:t>
+      </w:r>
+    </w:p>
+    <w:p>
+      <w:pPr>
+        <w:rPr>
+          <w:b/>
+          <w:bCs/>
+          <w:lang w:val="en-IL"/>
+        </w:rPr>
+      </w:pPr>
+    </w:p>
+    <w:p>
+      <w:pPr>
+        <w:rPr>
+          <w:b/>
+          <w:bCs/>
+          <w:lang w:val="en-IL"/>
+        </w:rPr>
+      </w:pPr>
+      <w:r>
+        <w:rPr>
+          <w:b/>
+          <w:bCs/>
+          <w:lang w:val="en-IL"/>
+        </w:rPr>
+        <w:t>Demographics</w:t>
+      </w:r>
+    </w:p>
+    <w:p>
+      <w:pPr>
+        <w:rPr>
+          <w:b/>
+          <w:bCs/>
+          <w:lang w:val="en-IL"/>
+        </w:rPr>
+      </w:pPr>
+    </w:p>
+    <w:p>
+      <w:pPr>
+        <w:rPr>
+          <w:b/>
+          <w:bCs/>
+          <w:lang w:val="en-IL"/>
+        </w:rPr>
+      </w:pPr>
+      <w:r>
+        <w:rPr>
+          <w:b/>
+          <w:bCs/>
+          <w:lang w:val="en-IL"/>
+        </w:rPr>
+        <w:t>Energy Transition</w:t>
+      </w:r>
+    </w:p>
+    <w:p>
+      <w:pPr>
+        <w:rPr>
+          <w:b/>
+          <w:bCs/>
+          <w:lang w:val="en-IL"/>
+        </w:rPr>
+      </w:pPr>
+      <w:r>
+        <w:rPr>
+          <w:b/>
+          <w:bCs/>
+          <w:lang w:val="en-IL"/>
+        </w:rPr>
+        <w:t>Purpose:</w:t>
+      </w:r>
+    </w:p>
+    <w:p>
+      <w:pPr>
+        <w:rPr>
+          <w:b/>
+          <w:bCs/>
+          <w:lang w:val="en-IL"/>
+        </w:rPr>
+      </w:pPr>
+      <w:r>
+        <w:rPr>
+          <w:b/>
+          <w:bCs/>
+          <w:lang w:val="en-IL"/>
+        </w:rPr>
+        <w:t>Rapid orientation.</w:t>
+      </w:r>
+    </w:p>
+    <w:p>
+      <w:pPr>
+        <w:rPr>
+          <w:b/>
+          <w:bCs/>
+          <w:lang w:val="en-IL"/>
+        </w:rPr>
+      </w:pPr>
+      <w:r>
+        <w:rPr>
+          <w:b/>
+          <w:bCs/>
+          <w:lang w:val="en-IL"/>
+        </w:rPr>
+        <w:pict w14:anchorId="703EA992">
+          <v:rect id="_x0000_i1221" style="width:0;height:1.5pt" o:hralign="center" o:hrstd="t" o:hr="t" fillcolor="#a0a0a0" stroked="f"/>
+        </w:pict>
+      </w:r>
+    </w:p>
+    <w:p>
+      <w:pPr>
+        <w:rPr>
+          <w:b/>
+          <w:bCs/>
+          <w:lang w:val="en-IL"/>
+        </w:rPr>
+      </w:pPr>
+      <w:r>
+        <w:rPr>
+          <w:b/>
+          <w:bCs/>
+          <w:lang w:val="en-IL"/>
+        </w:rPr>
+        <w:t>SECTION 6 — Comparison Hub</w:t>
+      </w:r>
+    </w:p>
+    <w:p>
+      <w:pPr>
+        <w:rPr>
+          <w:b/>
+          <w:bCs/>
+          <w:lang w:val="en-IL"/>
+        </w:rPr>
+      </w:pPr>
+      <w:r>
+        <w:rPr>
+          <w:b/>
+          <w:bCs/>
+          <w:lang w:val="en-IL"/>
+        </w:rPr>
+        <w:t>Comparison should be a core capability of this page.</w:t>
+      </w:r>
+    </w:p>
+    <w:p>
+      <w:pPr>
+        <w:rPr>
+          <w:b/>
+          <w:bCs/>
+          <w:lang w:val="en-IL"/>
+        </w:rPr>
+      </w:pPr>
+      <w:r>
+        <w:rPr>
+          <w:b/>
+          <w:bCs/>
+          <w:lang w:val="en-IL"/>
+        </w:rPr>
+        <w:lastRenderedPageBreak/>
+        <w:t>Not hidden elsewhere.</w:t>
+      </w:r>
+    </w:p>
+    <w:p>
+      <w:pPr>
+        <w:rPr>
+          <w:b/>
+          <w:bCs/>
+          <w:lang w:val="en-IL"/>
+        </w:rPr>
+      </w:pPr>
+      <w:r>
+        <w:rPr>
+          <w:b/>
+          <w:bCs/>
+          <w:lang w:val="en-IL"/>
+        </w:rPr>
+        <w:pict w14:anchorId="2EFC3FE0">
+          <v:rect id="_x0000_i1222" style="width:0;height:1.5pt" o:hralign="center" o:hrstd="t" o:hr="t" fillcolor="#a0a0a0" stroked="f"/>
+        </w:pict>
+      </w:r>
+    </w:p>
+    <w:p>
+      <w:pPr>
+        <w:rPr>
+          <w:b/>
+          <w:bCs/>
+          <w:lang w:val="en-IL"/>
+        </w:rPr>
+      </w:pPr>
+      <w:r>
+        <w:rPr>
+          <w:b/>
+          <w:bCs/>
+          <w:lang w:val="en-IL"/>
+        </w:rPr>
+        <w:t>Supported Comparisons</w:t>
+      </w:r>
+    </w:p>
+    <w:p>
+      <w:pPr>
+        <w:rPr>
+          <w:b/>
+          <w:bCs/>
+          <w:lang w:val="en-IL"/>
+        </w:rPr>
+      </w:pPr>
+      <w:r>
+        <w:rPr>
+          <w:b/>
+          <w:bCs/>
+          <w:lang w:val="en-IL"/>
+        </w:rPr>
+        <w:t>Country vs EU</w:t>
+      </w:r>
+    </w:p>
+    <w:p>
+      <w:pPr>
+        <w:rPr>
+          <w:b/>
+          <w:bCs/>
+          <w:lang w:val="en-IL"/>
+        </w:rPr>
+      </w:pPr>
+    </w:p>
+    <w:p>
+      <w:pPr>
+        <w:rPr>
+          <w:b/>
+          <w:bCs/>
+          <w:lang w:val="en-IL"/>
+        </w:rPr>
+      </w:pPr>
+      <w:r>
+        <w:rPr>
+          <w:b/>
+          <w:bCs/>
+          <w:lang w:val="en-IL"/>
+        </w:rPr>
+        <w:t>Country vs Family</w:t>
+      </w:r>
+    </w:p>
+    <w:p>
+      <w:pPr>
+        <w:rPr>
+          <w:b/>
+          <w:bCs/>
+          <w:lang w:val="en-IL"/>
+        </w:rPr>
+      </w:pPr>
+    </w:p>
+    <w:p>
+      <w:pPr>
+        <w:rPr>
+          <w:b/>
+          <w:bCs/>
+          <w:lang w:val="en-IL"/>
+        </w:rPr>
+      </w:pPr>
+      <w:r>
+        <w:rPr>
+          <w:b/>
+          <w:bCs/>
+          <w:lang w:val="en-IL"/>
+        </w:rPr>
+        <w:t>Country vs Country</w:t>
+      </w:r>
+    </w:p>
+    <w:p>
+      <w:pPr>
+        <w:rPr>
+          <w:b/>
+          <w:bCs/>
+          <w:lang w:val="en-IL"/>
+        </w:rPr>
+      </w:pPr>
+      <w:r>
+        <w:rPr>
+          <w:b/>
+          <w:bCs/>
+          <w:lang w:val="en-IL"/>
+        </w:rPr>
+        <w:t>Examples:</w:t>
+      </w:r>
+    </w:p>
+    <w:p>
+      <w:pPr>
+        <w:rPr>
+          <w:b/>
+          <w:bCs/>
+          <w:lang w:val="en-IL"/>
+        </w:rPr>
+      </w:pPr>
+      <w:r>
+        <w:rPr>
+          <w:b/>
+          <w:bCs/>
+          <w:lang w:val="en-IL"/>
+        </w:rPr>
+        <w:t>Germany vs Sweden</w:t>
+      </w:r>
+    </w:p>
+    <w:p>
+      <w:pPr>
+        <w:rPr>
+          <w:b/>
+          <w:bCs/>
+          <w:lang w:val="en-IL"/>
+        </w:rPr>
+      </w:pPr>
+    </w:p>
+    <w:p>
+      <w:pPr>
+        <w:rPr>
+          <w:b/>
+          <w:bCs/>
+          <w:lang w:val="en-IL"/>
+        </w:rPr>
+      </w:pPr>
+      <w:r>
+        <w:rPr>
+          <w:b/>
+          <w:bCs/>
+          <w:lang w:val="en-IL"/>
+        </w:rPr>
+        <w:t>Germany vs Poland</w:t>
+      </w:r>
+    </w:p>
+    <w:p>
+      <w:pPr>
+        <w:rPr>
+          <w:b/>
+          <w:bCs/>
+          <w:lang w:val="en-IL"/>
+        </w:rPr>
+      </w:pPr>
+    </w:p>
+    <w:p>
+      <w:pPr>
+        <w:rPr>
+          <w:b/>
+          <w:bCs/>
+          <w:lang w:val="en-IL"/>
+        </w:rPr>
+      </w:pPr>
+      <w:r>
+        <w:rPr>
+          <w:b/>
+          <w:bCs/>
+          <w:lang w:val="en-IL"/>
+        </w:rPr>
+        <w:t>Germany vs Netherlands</w:t>
+      </w:r>
+    </w:p>
+    <w:p>
+      <w:pPr>
+        <w:rPr>
+          <w:b/>
+          <w:bCs/>
+          <w:lang w:val="en-IL"/>
+        </w:rPr>
+      </w:pPr>
+      <w:r>
+        <w:rPr>
+          <w:b/>
+          <w:bCs/>
+          <w:lang w:val="en-IL"/>
+        </w:rPr>
+        <w:pict w14:anchorId="1E2B3557">
+          <v:rect id="_x0000_i1223" style="width:0;height:1.5pt" o:hralign="center" o:hrstd="t" o:hr="t" fillcolor="#a0a0a0" stroked="f"/>
+        </w:pict>
+      </w:r>
+    </w:p>
+    <w:p>
+      <w:pPr>
+        <w:rPr>
+          <w:b/>
+          <w:bCs/>
+          <w:lang w:val="en-IL"/>
+        </w:rPr>
+      </w:pPr>
+      <w:r>
+        <w:rPr>
+          <w:b/>
+          <w:bCs/>
+          <w:lang w:val="en-IL"/>
+        </w:rPr>
+        <w:t>Comparison Outputs</w:t>
+      </w:r>
+    </w:p>
+    <w:p>
+      <w:pPr>
+        <w:rPr>
+          <w:b/>
+          <w:bCs/>
+          <w:lang w:val="en-IL"/>
+        </w:rPr>
+      </w:pPr>
+      <w:r>
+        <w:rPr>
+          <w:b/>
+          <w:bCs/>
+          <w:lang w:val="en-IL"/>
+        </w:rPr>
+        <w:t>Dimensions</w:t>
+      </w:r>
+    </w:p>
+    <w:p>
+      <w:pPr>
+        <w:rPr>
+          <w:b/>
+          <w:bCs/>
+          <w:lang w:val="en-IL"/>
+        </w:rPr>
+      </w:pPr>
+      <w:proofErr w:type="spellStart"/>
+      <w:r>
+        <w:rPr>
+          <w:b/>
+          <w:bCs/>
+          <w:lang w:val="en-IL"/>
+        </w:rPr>
+        <w:t>KPIs</w:t>
+      </w:r>
+      <w:proofErr w:type="spellEnd"/>
+    </w:p>
+    <w:p>
+      <w:pPr>
+        <w:rPr>
+          <w:b/>
+          <w:bCs/>
+          <w:lang w:val="en-IL"/>
+        </w:rPr>
+      </w:pPr>
+      <w:r>
+        <w:rPr>
+          <w:b/>
+          <w:bCs/>
+          <w:lang w:val="en-IL"/>
+        </w:rPr>
+        <w:t>Evolution</w:t>
+      </w:r>
+    </w:p>
+    <w:p>
+      <w:pPr>
+        <w:rPr>
+          <w:b/>
+          <w:bCs/>
+          <w:lang w:val="en-IL"/>
+        </w:rPr>
+      </w:pPr>
+      <w:r>
+        <w:rPr>
+          <w:b/>
+          <w:bCs/>
+          <w:lang w:val="en-IL"/>
+        </w:rPr>
+        <w:t>Family Positioning</w:t>
+      </w:r>
+    </w:p>
+    <w:p>
+      <w:pPr>
+        <w:rPr>
+          <w:b/>
+          <w:bCs/>
+          <w:lang w:val="en-IL"/>
+        </w:rPr>
+      </w:pPr>
+      <w:proofErr w:type="spellStart"/>
+      <w:r>
+        <w:rPr>
+          <w:b/>
+          <w:bCs/>
+          <w:lang w:val="en-IL"/>
+        </w:rPr>
+        <w:t>Tradeoff</w:t>
+      </w:r>
+      <w:proofErr w:type="spellEnd"/>
+      <w:r>
+        <w:rPr>
+          <w:b/>
+          <w:bCs/>
+          <w:lang w:val="en-IL"/>
+        </w:rPr>
+        <w:t xml:space="preserve"> Position</w:t>
+      </w:r>
+    </w:p>
+    <w:p>
+      <w:pPr>
+        <w:rPr>
+          <w:b/>
+          <w:bCs/>
+          <w:lang w:val="en-IL"/>
+        </w:rPr>
+      </w:pPr>
+      <w:r>
+        <w:rPr>
+          <w:b/>
+          <w:bCs/>
+          <w:lang w:val="en-IL"/>
+        </w:rPr>
+        <w:pict w14:anchorId="7AAA1096">
+          <v:rect id="_x0000_i1224" style="width:0;height:1.5pt" o:hralign="center" o:hrstd="t" o:hr="t" fillcolor="#a0a0a0" stroked="f"/>
+        </w:pict>
+      </w:r>
+    </w:p>
+    <w:p>
+      <w:pPr>
+        <w:rPr>
+          <w:b/>
+          <w:bCs/>
+          <w:lang w:val="en-IL"/>
+        </w:rPr>
+      </w:pPr>
+      <w:r>
+        <w:rPr>
+          <w:b/>
+          <w:bCs/>
+          <w:lang w:val="en-IL"/>
+        </w:rPr>
+        <w:t>SECTION 7 — Guided Questions</w:t>
+      </w:r>
+    </w:p>
+    <w:p>
+      <w:pPr>
+        <w:rPr>
+          <w:b/>
+          <w:bCs/>
+          <w:lang w:val="en-IL"/>
+        </w:rPr>
+      </w:pPr>
+      <w:r>
+        <w:rPr>
+          <w:b/>
+          <w:bCs/>
+          <w:lang w:val="en-IL"/>
+        </w:rPr>
+        <w:t>Purpose:</w:t>
+      </w:r>
+    </w:p>
+    <w:p>
+      <w:pPr>
+        <w:rPr>
+          <w:b/>
+          <w:bCs/>
+          <w:lang w:val="en-IL"/>
+        </w:rPr>
+      </w:pPr>
+      <w:r>
+        <w:rPr>
+          <w:b/>
+          <w:bCs/>
+          <w:lang w:val="en-IL"/>
+        </w:rPr>
+        <w:t>Encourage investigation.</w:t>
+      </w:r>
+    </w:p>
+    <w:p>
+      <w:pPr>
+        <w:rPr>
+          <w:b/>
+          <w:bCs/>
+          <w:lang w:val="en-IL"/>
+        </w:rPr>
+      </w:pPr>
+      <w:r>
+        <w:rPr>
+          <w:b/>
+          <w:bCs/>
+          <w:lang w:val="en-IL"/>
+        </w:rPr>
+        <w:t>Examples:</w:t>
+      </w:r>
+    </w:p>
+    <w:p>
+      <w:pPr>
+        <w:rPr>
+          <w:b/>
+          <w:bCs/>
+          <w:lang w:val="en-IL"/>
+        </w:rPr>
+      </w:pPr>
+      <w:r>
+        <w:rPr>
+          <w:b/>
+          <w:bCs/>
+          <w:lang w:val="en-IL"/>
+        </w:rPr>
+        <w:t>Why does Germany differ from Sweden?</w:t>
+      </w:r>
+    </w:p>
+    <w:p>
+      <w:pPr>
+        <w:rPr>
+          <w:b/>
+          <w:bCs/>
+          <w:lang w:val="en-IL"/>
+        </w:rPr>
+      </w:pPr>
+    </w:p>
+    <w:p>
+      <w:pPr>
+        <w:rPr>
+          <w:b/>
+          <w:bCs/>
+          <w:lang w:val="en-IL"/>
+        </w:rPr>
+      </w:pPr>
+      <w:r>
+        <w:rPr>
+          <w:b/>
+          <w:bCs/>
+          <w:lang w:val="en-IL"/>
+        </w:rPr>
+        <w:lastRenderedPageBreak/>
+        <w:t>How has Germany changed since 2014?</w:t>
+      </w:r>
+    </w:p>
+    <w:p>
+      <w:pPr>
+        <w:rPr>
+          <w:b/>
+          <w:bCs/>
+          <w:lang w:val="en-IL"/>
+        </w:rPr>
+      </w:pPr>
+    </w:p>
+    <w:p>
+      <w:pPr>
+        <w:rPr>
+          <w:b/>
+          <w:bCs/>
+          <w:lang w:val="en-IL"/>
+        </w:rPr>
+      </w:pPr>
+      <w:r>
+        <w:rPr>
+          <w:b/>
+          <w:bCs/>
+          <w:lang w:val="en-IL"/>
+        </w:rPr>
+        <w:t>What makes Germany an Innovation Core economy?</w:t>
+      </w:r>
+    </w:p>
+    <w:p>
+      <w:pPr>
+        <w:rPr>
+          <w:b/>
+          <w:bCs/>
+          <w:lang w:val="en-IL"/>
+        </w:rPr>
+      </w:pPr>
+    </w:p>
+    <w:p>
+      <w:pPr>
+        <w:rPr>
+          <w:b/>
+          <w:bCs/>
+          <w:lang w:val="en-IL"/>
+        </w:rPr>
+      </w:pPr>
+      <w:r>
+        <w:rPr>
+          <w:b/>
+          <w:bCs/>
+          <w:lang w:val="en-IL"/>
+        </w:rPr>
+        <w:t>Why does Germany perform differently from its family average?</w:t>
+      </w:r>
+    </w:p>
+    <w:p>
+      <w:pPr>
+        <w:rPr>
+          <w:b/>
+          <w:bCs/>
+          <w:lang w:val="en-IL"/>
+        </w:rPr>
+      </w:pPr>
+      <w:r>
+        <w:rPr>
+          <w:b/>
+          <w:bCs/>
+          <w:lang w:val="en-IL"/>
+        </w:rPr>
+        <w:t>These questions guide users toward deeper exploration.</w:t>
+      </w:r>
+    </w:p>
+    <w:p>
+      <w:pPr>
+        <w:rPr>
+          <w:b/>
+          <w:bCs/>
+          <w:lang w:val="en-IL"/>
+        </w:rPr>
+      </w:pPr>
+      <w:r>
+        <w:rPr>
+          <w:b/>
+          <w:bCs/>
+          <w:lang w:val="en-IL"/>
+        </w:rPr>
+        <w:pict w14:anchorId="694B3D5B">
+          <v:rect id="_x0000_i1225" style="width:0;height:1.5pt" o:hralign="center" o:hrstd="t" o:hr="t" fillcolor="#a0a0a0" stroked="f"/>
+        </w:pict>
+      </w:r>
+    </w:p>
+    <w:p>
+      <w:pPr>
+        <w:rPr>
+          <w:b/>
+          <w:bCs/>
+          <w:lang w:val="en-IL"/>
+        </w:rPr>
+      </w:pPr>
+      <w:r>
+        <w:rPr>
+          <w:b/>
+          <w:bCs/>
+          <w:lang w:val="en-IL"/>
+        </w:rPr>
+        <w:t>SECTION 8 — Suggested Next Step</w:t>
+      </w:r>
+    </w:p>
+    <w:p>
+      <w:pPr>
+        <w:rPr>
+          <w:b/>
+          <w:bCs/>
+          <w:lang w:val="en-IL"/>
+        </w:rPr>
+      </w:pPr>
+      <w:r>
+        <w:rPr>
+          <w:b/>
+          <w:bCs/>
+          <w:lang w:val="en-IL"/>
+        </w:rPr>
+        <w:t>Always visible.</w:t>
+      </w:r>
+    </w:p>
+    <w:p>
+      <w:pPr>
+        <w:rPr>
+          <w:b/>
+          <w:bCs/>
+          <w:lang w:val="en-IL"/>
+        </w:rPr>
+      </w:pPr>
+      <w:r>
+        <w:rPr>
+          <w:b/>
+          <w:bCs/>
+          <w:lang w:val="en-IL"/>
+        </w:rPr>
+        <w:t>Example:</w:t>
+      </w:r>
+    </w:p>
+    <w:p>
+      <w:pPr>
+        <w:rPr>
+          <w:b/>
+          <w:bCs/>
+          <w:lang w:val="en-IL"/>
+        </w:rPr>
+      </w:pPr>
+      <w:r>
+        <w:rPr>
+          <w:b/>
+          <w:bCs/>
+          <w:lang w:val="en-IL"/>
+        </w:rPr>
+        <w:t xml:space="preserve">Continue to </w:t>
+      </w:r>
+      <w:proofErr w:type="spellStart"/>
+      <w:r>
+        <w:rPr>
+          <w:b/>
+          <w:bCs/>
+          <w:lang w:val="en-IL"/>
+        </w:rPr>
+        <w:t>Tradeoff</w:t>
+      </w:r>
+      <w:proofErr w:type="spellEnd"/>
+      <w:r>
+        <w:rPr>
+          <w:b/>
+          <w:bCs/>
+          <w:lang w:val="en-IL"/>
+        </w:rPr>
+        <w:t xml:space="preserve"> Explorer →</w:t>
+      </w:r>
+    </w:p>
+    <w:p>
+      <w:pPr>
+        <w:rPr>
+          <w:b/>
+          <w:bCs/>
+          <w:lang w:val="en-IL"/>
+        </w:rPr>
+      </w:pPr>
+      <w:r>
+        <w:rPr>
+          <w:b/>
+          <w:bCs/>
+          <w:lang w:val="en-IL"/>
+        </w:rPr>
+        <w:t>or</w:t>
+      </w:r>
+    </w:p>
+    <w:p>
+      <w:pPr>
+        <w:rPr>
+          <w:b/>
+          <w:bCs/>
+          <w:lang w:val="en-IL"/>
+        </w:rPr>
+      </w:pPr>
+      <w:r>
+        <w:rPr>
+          <w:b/>
+          <w:bCs/>
+          <w:lang w:val="en-IL"/>
+        </w:rPr>
+        <w:t xml:space="preserve">Investigate Germany's Innovation vs Sustainability </w:t>
+      </w:r>
+      <w:proofErr w:type="spellStart"/>
+      <w:r>
+        <w:rPr>
+          <w:b/>
+          <w:bCs/>
+          <w:lang w:val="en-IL"/>
+        </w:rPr>
+        <w:t>tradeoff</w:t>
+      </w:r>
+      <w:proofErr w:type="spellEnd"/>
+      <w:r>
+        <w:rPr>
+          <w:b/>
+          <w:bCs/>
+          <w:lang w:val="en-IL"/>
+        </w:rPr>
+        <w:t xml:space="preserve"> →</w:t>
+      </w:r>
+    </w:p>
+    <w:p>
+      <w:pPr>
+        <w:rPr>
+          <w:b/>
+          <w:bCs/>
+          <w:lang w:val="en-IL"/>
+        </w:rPr>
+      </w:pPr>
+      <w:r>
+        <w:rPr>
+          <w:b/>
+          <w:bCs/>
+          <w:lang w:val="en-IL"/>
+        </w:rPr>
+        <w:t>The application should always suggest the next exploration action.</w:t>
+      </w:r>
+    </w:p>
+    <w:p>
+      <w:pPr>
+        <w:rPr>
+          <w:b/>
+          <w:bCs/>
+          <w:lang w:val="en-IL"/>
+        </w:rPr>
+      </w:pPr>
+      <w:r>
+        <w:rPr>
+          <w:b/>
+          <w:bCs/>
+          <w:lang w:val="en-IL"/>
+        </w:rPr>
+        <w:pict w14:anchorId="067DB76F">
+          <v:rect id="_x0000_i1226" style="width:0;height:1.5pt" o:hralign="center" o:hrstd="t" o:hr="t" fillcolor="#a0a0a0" stroked="f"/>
+        </w:pict>
+      </w:r>
+    </w:p>
+    <w:p>
+      <w:pPr>
+        <w:rPr>
+          <w:b/>
+          <w:bCs/>
+          <w:lang w:val="en-IL"/>
+        </w:rPr>
+      </w:pPr>
+      <w:r>
+        <w:rPr>
+          <w:b/>
+          <w:bCs/>
+          <w:lang w:val="en-IL"/>
+        </w:rPr>
+        <w:t>Future AI Placeholder</w:t>
+      </w:r>
+    </w:p>
+    <w:p>
+      <w:pPr>
+        <w:rPr>
+          <w:b/>
+          <w:bCs/>
+          <w:lang w:val="en-IL"/>
+        </w:rPr>
+      </w:pPr>
+      <w:r>
+        <w:rPr>
+          <w:b/>
+          <w:bCs/>
+          <w:lang w:val="en-IL"/>
+        </w:rPr>
+        <w:t>Persistent but inactive in MVP.</w:t>
+      </w:r>
+    </w:p>
+    <w:p>
+      <w:pPr>
+        <w:rPr>
+          <w:b/>
+          <w:bCs/>
+          <w:lang w:val="en-IL"/>
+        </w:rPr>
+      </w:pPr>
+      <w:r>
+        <w:rPr>
+          <w:b/>
+          <w:bCs/>
+          <w:lang w:val="en-IL"/>
+        </w:rPr>
+        <w:t>Example:</w:t>
+      </w:r>
+    </w:p>
+    <w:p>
+      <w:pPr>
+        <w:rPr>
+          <w:b/>
+          <w:bCs/>
+          <w:lang w:val="en-IL"/>
+        </w:rPr>
+      </w:pPr>
+      <w:r>
+        <w:rPr>
+          <w:rFonts w:ascii="Segoe UI Emoji" w:hAnsi="Segoe UI Emoji" w:cs="Segoe UI Emoji"/>
+          <w:b/>
+          <w:bCs/>
+          <w:lang w:val="en-IL"/>
+        </w:rPr>
+        <w:t>🤖</w:t>
+      </w:r>
+      <w:r>
+        <w:rPr>
+          <w:b/>
+          <w:bCs/>
+          <w:lang w:val="en-IL"/>
+        </w:rPr>
+        <w:t xml:space="preserve"> Strategy Guide (Coming in V2)</w:t>
+      </w:r>
+    </w:p>
+    <w:p>
+      <w:pPr>
+        <w:rPr>
+          <w:b/>
+          <w:bCs/>
+          <w:lang w:val="en-IL"/>
+        </w:rPr>
+      </w:pPr>
+    </w:p>
+    <w:p>
+      <w:pPr>
+        <w:rPr>
+          <w:b/>
+          <w:bCs/>
+          <w:lang w:val="en-IL"/>
+        </w:rPr>
+      </w:pPr>
+      <w:r>
+        <w:rPr>
+          <w:b/>
+          <w:bCs/>
+          <w:lang w:val="en-IL"/>
+        </w:rPr>
+        <w:t>Ask:</w:t>
+      </w:r>
+    </w:p>
+    <w:p>
+      <w:pPr>
+        <w:rPr>
+          <w:b/>
+          <w:bCs/>
+          <w:lang w:val="en-IL"/>
+        </w:rPr>
+      </w:pPr>
+      <w:r>
+        <w:rPr>
+          <w:b/>
+          <w:bCs/>
+          <w:lang w:val="en-IL"/>
+        </w:rPr>
+        <w:t>- Why is Germany here?</w:t>
+      </w:r>
+    </w:p>
+    <w:p>
+      <w:pPr>
+        <w:rPr>
+          <w:b/>
+          <w:bCs/>
+          <w:lang w:val="en-IL"/>
+        </w:rPr>
+      </w:pPr>
+      <w:r>
+        <w:rPr>
+          <w:b/>
+          <w:bCs/>
+          <w:lang w:val="en-IL"/>
+        </w:rPr>
+        <w:t>- Compare Germany and Sweden.</w:t>
+      </w:r>
+    </w:p>
+    <w:p>
+      <w:pPr>
+        <w:rPr>
+          <w:b/>
+          <w:bCs/>
+          <w:lang w:val="en-IL"/>
+        </w:rPr>
+      </w:pPr>
+      <w:r>
+        <w:rPr>
+          <w:b/>
+          <w:bCs/>
+          <w:lang w:val="en-IL"/>
+        </w:rPr>
+        <w:t>- Explain this trajectory.</w:t>
+      </w:r>
+    </w:p>
+    <w:p>
+      <w:pPr>
+        <w:rPr>
+          <w:b/>
+          <w:bCs/>
+          <w:lang w:val="en-IL"/>
+        </w:rPr>
+      </w:pPr>
+      <w:r>
+        <w:rPr>
+          <w:b/>
+          <w:bCs/>
+          <w:lang w:val="en-IL"/>
+        </w:rPr>
+        <w:t xml:space="preserve">- Explain this </w:t>
+      </w:r>
+      <w:proofErr w:type="spellStart"/>
+      <w:r>
+        <w:rPr>
+          <w:b/>
+          <w:bCs/>
+          <w:lang w:val="en-IL"/>
+        </w:rPr>
+        <w:t>tradeoff</w:t>
+      </w:r>
+      <w:proofErr w:type="spellEnd"/>
+      <w:r>
+        <w:rPr>
+          <w:b/>
+          <w:bCs/>
+          <w:lang w:val="en-IL"/>
+        </w:rPr>
+        <w:t>.</w:t>
+      </w:r>
+    </w:p>
+    <w:p>
+      <w:pPr>
+        <w:rPr>
+          <w:b/>
+          <w:bCs/>
+          <w:lang w:val="en-IL"/>
+        </w:rPr>
+      </w:pPr>
+      <w:r>
+        <w:rPr>
+          <w:b/>
+          <w:bCs/>
+          <w:lang w:val="en-IL"/>
+        </w:rPr>
+        <w:t>The UI location should already exist in MVP.</w:t>
+      </w:r>
+    </w:p>
+    <w:p>
+      <w:pPr>
+        <w:rPr>
+          <w:b/>
+          <w:bCs/>
+          <w:lang w:val="en-IL"/>
+        </w:rPr>
+      </w:pPr>
+      <w:r>
+        <w:rPr>
+          <w:b/>
+          <w:bCs/>
+          <w:lang w:val="en-IL"/>
+        </w:rPr>
+        <w:t>Only the intelligence changes later.</w:t>
+      </w:r>
+    </w:p>
+    <w:p>
+      <w:pPr>
+        <w:rPr>
+          <w:b/>
+          <w:bCs/>
+          <w:lang w:val="en-IL"/>
+        </w:rPr>
+      </w:pPr>
+      <w:r>
+        <w:rPr>
+          <w:b/>
+          <w:bCs/>
+          <w:lang w:val="en-IL"/>
+        </w:rPr>
+        <w:pict w14:anchorId="1FF2DBF7">
+          <v:rect id="_x0000_i1227" style="width:0;height:1.5pt" o:hralign="center" o:hrstd="t" o:hr="t" fillcolor="#a0a0a0" stroked="f"/>
+        </w:pict>
+      </w:r>
+    </w:p>
+    <w:p>
+      <w:pPr>
+        <w:rPr>
+          <w:b/>
+          <w:bCs/>
+          <w:lang w:val="en-IL"/>
+        </w:rPr>
+      </w:pPr>
+      <w:r>
+        <w:rPr>
+          <w:b/>
+          <w:bCs/>
+          <w:lang w:val="en-IL"/>
+        </w:rPr>
+        <w:lastRenderedPageBreak/>
+        <w:t>Visual Philosophy</w:t>
+      </w:r>
+    </w:p>
+    <w:p>
+      <w:pPr>
+        <w:rPr>
+          <w:b/>
+          <w:bCs/>
+          <w:lang w:val="en-IL"/>
+        </w:rPr>
+      </w:pPr>
+      <w:r>
+        <w:rPr>
+          <w:b/>
+          <w:bCs/>
+          <w:lang w:val="en-IL"/>
+        </w:rPr>
+        <w:t>The page should feel like:</w:t>
+      </w:r>
+    </w:p>
+    <w:p>
+      <w:pPr>
+        <w:rPr>
+          <w:b/>
+          <w:bCs/>
+          <w:lang w:val="en-IL"/>
+        </w:rPr>
+      </w:pPr>
+      <w:r>
+        <w:rPr>
+          <w:b/>
+          <w:bCs/>
+          <w:lang w:val="en-IL"/>
+        </w:rPr>
+        <w:t>Atlas</w:t>
+      </w:r>
+    </w:p>
+    <w:p>
+      <w:pPr>
+        <w:rPr>
+          <w:b/>
+          <w:bCs/>
+          <w:lang w:val="en-IL"/>
+        </w:rPr>
+      </w:pPr>
+      <w:r>
+        <w:rPr>
+          <w:b/>
+          <w:bCs/>
+          <w:lang w:val="en-IL"/>
+        </w:rPr>
+        <w:t>+</w:t>
+      </w:r>
+    </w:p>
+    <w:p>
+      <w:pPr>
+        <w:rPr>
+          <w:b/>
+          <w:bCs/>
+          <w:lang w:val="en-IL"/>
+        </w:rPr>
+      </w:pPr>
+      <w:r>
+        <w:rPr>
+          <w:b/>
+          <w:bCs/>
+          <w:lang w:val="en-IL"/>
+        </w:rPr>
+        <w:t>Museum</w:t>
+      </w:r>
+    </w:p>
+    <w:p>
+      <w:pPr>
+        <w:rPr>
+          <w:b/>
+          <w:bCs/>
+          <w:lang w:val="en-IL"/>
+        </w:rPr>
+      </w:pPr>
+      <w:r>
+        <w:rPr>
+          <w:b/>
+          <w:bCs/>
+          <w:lang w:val="en-IL"/>
+        </w:rPr>
+        <w:t>+</w:t>
+      </w:r>
+    </w:p>
+    <w:p>
+      <w:pPr>
+        <w:rPr>
+          <w:b/>
+          <w:bCs/>
+          <w:lang w:val="en-IL"/>
+        </w:rPr>
+      </w:pPr>
+      <w:r>
+        <w:rPr>
+          <w:b/>
+          <w:bCs/>
+          <w:lang w:val="en-IL"/>
+        </w:rPr>
+        <w:t>Discovery Experience</w:t>
+      </w:r>
+    </w:p>
+    <w:p>
+      <w:pPr>
+        <w:rPr>
+          <w:b/>
+          <w:bCs/>
+          <w:lang w:val="en-IL"/>
+        </w:rPr>
+      </w:pPr>
+      <w:r>
+        <w:rPr>
+          <w:b/>
+          <w:bCs/>
+          <w:lang w:val="en-IL"/>
+        </w:rPr>
+        <w:t>NOT:</w:t>
+      </w:r>
+    </w:p>
+    <w:p>
+      <w:pPr>
+        <w:rPr>
+          <w:b/>
+          <w:bCs/>
+          <w:lang w:val="en-IL"/>
+        </w:rPr>
+      </w:pPr>
+      <w:r>
+        <w:rPr>
+          <w:b/>
+          <w:bCs/>
+          <w:lang w:val="en-IL"/>
+        </w:rPr>
+        <w:t>Power BI</w:t>
+      </w:r>
+    </w:p>
+    <w:p>
+      <w:pPr>
+        <w:rPr>
+          <w:b/>
+          <w:bCs/>
+          <w:lang w:val="en-IL"/>
+        </w:rPr>
+      </w:pPr>
+    </w:p>
+    <w:p>
+      <w:pPr>
+        <w:rPr>
+          <w:b/>
+          <w:bCs/>
+          <w:lang w:val="en-IL"/>
+        </w:rPr>
+      </w:pPr>
+      <w:r>
+        <w:rPr>
+          <w:b/>
+          <w:bCs/>
+          <w:lang w:val="en-IL"/>
+        </w:rPr>
+        <w:t>Tableau</w:t>
+      </w:r>
+    </w:p>
+    <w:p>
+      <w:pPr>
+        <w:rPr>
+          <w:b/>
+          <w:bCs/>
+          <w:lang w:val="en-IL"/>
+        </w:rPr>
+      </w:pPr>
+    </w:p>
+    <w:p>
+      <w:pPr>
+        <w:rPr>
+          <w:b/>
+          <w:bCs/>
+          <w:lang w:val="en-IL"/>
+        </w:rPr>
+      </w:pPr>
+      <w:r>
+        <w:rPr>
+          <w:b/>
+          <w:bCs/>
+          <w:lang w:val="en-IL"/>
+        </w:rPr>
+        <w:t>Corporate Dashboard</w:t>
+      </w:r>
+    </w:p>
+    <w:p>
+      <w:pPr>
+        <w:rPr>
+          <w:b/>
+          <w:bCs/>
+          <w:lang w:val="en-IL"/>
+        </w:rPr>
+      </w:pPr>
+      <w:r>
+        <w:rPr>
+          <w:b/>
+          <w:bCs/>
+          <w:lang w:val="en-IL"/>
+        </w:rPr>
+        <w:pict w14:anchorId="42ED66E0">
+          <v:rect id="_x0000_i1228" style="width:0;height:1.5pt" o:hralign="center" o:hrstd="t" o:hr="t" fillcolor="#a0a0a0" stroked="f"/>
+        </w:pict>
+      </w:r>
+    </w:p>
+    <w:p>
+      <w:pPr>
+        <w:rPr>
+          <w:b/>
+          <w:bCs/>
+          <w:lang w:val="en-IL"/>
+        </w:rPr>
+      </w:pPr>
+      <w:r>
+        <w:rPr>
+          <w:b/>
+          <w:bCs/>
+          <w:lang w:val="en-IL"/>
+        </w:rPr>
+        <w:t>Success Criteria</w:t>
+      </w:r>
+    </w:p>
+    <w:p>
+      <w:pPr>
+        <w:rPr>
+          <w:b/>
+          <w:bCs/>
+          <w:lang w:val="en-IL"/>
+        </w:rPr>
+      </w:pPr>
+      <w:r>
+        <w:rPr>
+          <w:b/>
+          <w:bCs/>
+          <w:lang w:val="en-IL"/>
+        </w:rPr>
+        <w:t>A successful Country Explorer page enables the user to answer:</w:t>
+      </w:r>
+    </w:p>
+    <w:p>
+      <w:pPr>
+        <w:rPr>
+          <w:b/>
+          <w:bCs/>
+          <w:lang w:val="en-IL"/>
+        </w:rPr>
+      </w:pPr>
+      <w:r>
+        <w:rPr>
+          <w:b/>
+          <w:bCs/>
+          <w:lang w:val="en-IL"/>
+        </w:rPr>
+        <w:t>Who is this country?</w:t>
+      </w:r>
+    </w:p>
+    <w:p>
+      <w:pPr>
+        <w:rPr>
+          <w:b/>
+          <w:bCs/>
+          <w:lang w:val="en-IL"/>
+        </w:rPr>
+      </w:pPr>
+    </w:p>
+    <w:p>
+      <w:pPr>
+        <w:rPr>
+          <w:b/>
+          <w:bCs/>
+          <w:lang w:val="en-IL"/>
+        </w:rPr>
+      </w:pPr>
+      <w:r>
+        <w:rPr>
+          <w:b/>
+          <w:bCs/>
+          <w:lang w:val="en-IL"/>
+        </w:rPr>
+        <w:t>How did it get here?</w:t>
+      </w:r>
+    </w:p>
+    <w:p>
+      <w:pPr>
+        <w:rPr>
+          <w:b/>
+          <w:bCs/>
+          <w:lang w:val="en-IL"/>
+        </w:rPr>
+      </w:pPr>
+    </w:p>
+    <w:p>
+      <w:pPr>
+        <w:rPr>
+          <w:b/>
+          <w:bCs/>
+          <w:lang w:val="en-IL"/>
+        </w:rPr>
+      </w:pPr>
+      <w:r>
+        <w:rPr>
+          <w:b/>
+          <w:bCs/>
+          <w:lang w:val="en-IL"/>
+        </w:rPr>
+        <w:t>How does it compare to Europe?</w:t>
+      </w:r>
+    </w:p>
+    <w:p>
+      <w:pPr>
+        <w:rPr>
+          <w:b/>
+          <w:bCs/>
+          <w:lang w:val="en-IL"/>
+        </w:rPr>
+      </w:pPr>
+    </w:p>
+    <w:p>
+      <w:pPr>
+        <w:rPr>
+          <w:b/>
+          <w:bCs/>
+          <w:lang w:val="en-IL"/>
+        </w:rPr>
+      </w:pPr>
+      <w:r>
+        <w:rPr>
+          <w:b/>
+          <w:bCs/>
+          <w:lang w:val="en-IL"/>
+        </w:rPr>
+        <w:t>Which family does it belong to?</w:t>
+      </w:r>
+    </w:p>
+    <w:p>
+      <w:pPr>
+        <w:rPr>
+          <w:b/>
+          <w:bCs/>
+          <w:lang w:val="en-IL"/>
+        </w:rPr>
+      </w:pPr>
+    </w:p>
+    <w:p>
+      <w:pPr>
+        <w:rPr>
+          <w:b/>
+          <w:bCs/>
+          <w:lang w:val="en-IL"/>
+        </w:rPr>
+      </w:pPr>
+      <w:r>
+        <w:rPr>
+          <w:b/>
+          <w:bCs/>
+          <w:lang w:val="en-IL"/>
+        </w:rPr>
+        <w:t>What questions should I investigate next?</w:t>
+      </w:r>
+    </w:p>
+    <w:p>
+      <w:pPr>
+        <w:rPr>
+          <w:b/>
+          <w:bCs/>
+          <w:lang w:val="en-IL"/>
+        </w:rPr>
+      </w:pPr>
+      <w:r>
+        <w:rPr>
+          <w:b/>
+          <w:bCs/>
+          <w:lang w:val="en-IL"/>
+        </w:rPr>
+        <w:t xml:space="preserve">before entering the </w:t>
+      </w:r>
+      <w:proofErr w:type="spellStart"/>
+      <w:r>
+        <w:rPr>
+          <w:b/>
+          <w:bCs/>
+          <w:lang w:val="en-IL"/>
+        </w:rPr>
+        <w:t>Tradeoff</w:t>
+      </w:r>
+      <w:proofErr w:type="spellEnd"/>
+      <w:r>
+        <w:rPr>
+          <w:b/>
+          <w:bCs/>
+          <w:lang w:val="en-IL"/>
+        </w:rPr>
+        <w:t xml:space="preserve"> Explorer.</w:t>
+      </w:r>
     </w:p>
     <w:p>
       <w:pPr>

</xml_diff>